<commit_message>
Expand Meeting Patterns Part 1 review practice
</commit_message>
<xml_diff>
--- a/이근호님/이근호님_Meeting_Patterns_Part1_강사용.docx
+++ b/이근호님/이근호님_Meeting_Patterns_Part1_강사용.docx
@@ -11219,6 +11219,4511 @@
           <w:sz w:val="21"/>
         </w:rPr>
         <w:t>The company is undergoing a system upgrade this weekend.</w:t>
+      </w:r>
+    </w:p>
+    <w:p>
+      <w:r>
+        <w:br w:type="page"/>
+      </w:r>
+    </w:p>
+    <w:p>
+      <w:pPr>
+        <w:keepNext w:val="0"/>
+        <w:spacing w:before="0" w:after="80" w:line="269" w:lineRule="auto"/>
+      </w:pPr>
+      <w:r>
+        <w:rPr>
+          <w:rFonts w:ascii="맑은 고딕" w:hAnsi="맑은 고딕" w:eastAsia="맑은 고딕"/>
+          <w:b/>
+          <w:i w:val="0"/>
+          <w:color w:val="F47B20"/>
+          <w:sz w:val="44"/>
+        </w:rPr>
+        <w:t>Review Practice — Pattern Challenge 001~031</w:t>
+      </w:r>
+    </w:p>
+    <w:p>
+      <w:pPr>
+        <w:keepNext w:val="0"/>
+        <w:spacing w:before="0" w:after="240" w:line="269" w:lineRule="auto"/>
+      </w:pPr>
+      <w:r>
+        <w:rPr>
+          <w:rFonts w:ascii="맑은 고딕" w:hAnsi="맑은 고딕" w:eastAsia="맑은 고딕"/>
+          <w:b w:val="0"/>
+          <w:i w:val="0"/>
+          <w:color w:val="595959"/>
+          <w:sz w:val="22"/>
+        </w:rPr>
+        <w:t>교재 19~63쪽의 네 개 Review 구간을 반영한 종합 연습</w:t>
+      </w:r>
+    </w:p>
+    <w:tbl>
+      <w:tblPr>
+        <w:tblW w:type="dxa" w:w="9360"/>
+        <w:jc w:val="left"/>
+        <w:tblLayout w:type="fixed"/>
+        <w:tblLook w:firstColumn="1" w:firstRow="1" w:lastColumn="0" w:lastRow="0" w:noHBand="0" w:noVBand="1" w:val="04A0"/>
+        <w:tblInd w:type="dxa" w:w="120"/>
+      </w:tblPr>
+      <w:tblGrid>
+        <w:gridCol w:w="1800"/>
+        <w:gridCol w:w="1656"/>
+        <w:gridCol w:w="5904"/>
+      </w:tblGrid>
+      <w:tr>
+        <w:trPr>
+          <w:tblHeader w:val="true"/>
+        </w:trPr>
+        <w:tc>
+          <w:tcPr>
+            <w:tcW w:type="dxa" w:w="1800"/>
+            <w:vAlign w:val="center"/>
+            <w:shd w:fill="F47B20"/>
+            <w:tcMar>
+              <w:top w:w="100" w:type="dxa"/>
+              <w:bottom w:w="100" w:type="dxa"/>
+              <w:start w:w="120" w:type="dxa"/>
+              <w:end w:w="120" w:type="dxa"/>
+            </w:tcMar>
+          </w:tcPr>
+          <w:p>
+            <w:pPr>
+              <w:keepNext w:val="0"/>
+              <w:spacing w:before="0" w:after="0" w:line="269" w:lineRule="auto"/>
+              <w:jc w:val="center"/>
+            </w:pPr>
+            <w:r/>
+            <w:r>
+              <w:rPr>
+                <w:rFonts w:ascii="맑은 고딕" w:hAnsi="맑은 고딕" w:eastAsia="맑은 고딕"/>
+                <w:b/>
+                <w:i w:val="0"/>
+                <w:color w:val="FFFFFF"/>
+                <w:sz w:val="19"/>
+              </w:rPr>
+              <w:t>Unit</w:t>
+            </w:r>
+          </w:p>
+        </w:tc>
+        <w:tc>
+          <w:tcPr>
+            <w:tcW w:type="dxa" w:w="1656"/>
+            <w:vAlign w:val="center"/>
+            <w:shd w:fill="F47B20"/>
+            <w:tcMar>
+              <w:top w:w="100" w:type="dxa"/>
+              <w:bottom w:w="100" w:type="dxa"/>
+              <w:start w:w="120" w:type="dxa"/>
+              <w:end w:w="120" w:type="dxa"/>
+            </w:tcMar>
+          </w:tcPr>
+          <w:p>
+            <w:pPr>
+              <w:keepNext w:val="0"/>
+              <w:spacing w:before="0" w:after="0" w:line="269" w:lineRule="auto"/>
+              <w:jc w:val="center"/>
+            </w:pPr>
+            <w:r/>
+            <w:r>
+              <w:rPr>
+                <w:rFonts w:ascii="맑은 고딕" w:hAnsi="맑은 고딕" w:eastAsia="맑은 고딕"/>
+                <w:b/>
+                <w:i w:val="0"/>
+                <w:color w:val="FFFFFF"/>
+                <w:sz w:val="19"/>
+              </w:rPr>
+              <w:t>Patterns</w:t>
+            </w:r>
+          </w:p>
+        </w:tc>
+        <w:tc>
+          <w:tcPr>
+            <w:tcW w:type="dxa" w:w="5904"/>
+            <w:vAlign w:val="center"/>
+            <w:shd w:fill="F47B20"/>
+            <w:tcMar>
+              <w:top w:w="100" w:type="dxa"/>
+              <w:bottom w:w="100" w:type="dxa"/>
+              <w:start w:w="120" w:type="dxa"/>
+              <w:end w:w="120" w:type="dxa"/>
+            </w:tcMar>
+          </w:tcPr>
+          <w:p>
+            <w:pPr>
+              <w:keepNext w:val="0"/>
+              <w:spacing w:before="0" w:after="0" w:line="269" w:lineRule="auto"/>
+              <w:jc w:val="center"/>
+            </w:pPr>
+            <w:r/>
+            <w:r>
+              <w:rPr>
+                <w:rFonts w:ascii="맑은 고딕" w:hAnsi="맑은 고딕" w:eastAsia="맑은 고딕"/>
+                <w:b/>
+                <w:i w:val="0"/>
+                <w:color w:val="FFFFFF"/>
+                <w:sz w:val="19"/>
+              </w:rPr>
+              <w:t>Focus</w:t>
+            </w:r>
+          </w:p>
+        </w:tc>
+      </w:tr>
+      <w:tr>
+        <w:trPr/>
+        <w:tc>
+          <w:tcPr>
+            <w:tcW w:type="dxa" w:w="1800"/>
+            <w:vAlign w:val="center"/>
+            <w:tcMar>
+              <w:top w:w="100" w:type="dxa"/>
+              <w:bottom w:w="100" w:type="dxa"/>
+              <w:start w:w="120" w:type="dxa"/>
+              <w:end w:w="120" w:type="dxa"/>
+            </w:tcMar>
+          </w:tcPr>
+          <w:p>
+            <w:pPr>
+              <w:keepNext w:val="0"/>
+              <w:spacing w:before="0" w:after="0" w:line="269" w:lineRule="auto"/>
+              <w:jc w:val="center"/>
+            </w:pPr>
+            <w:r/>
+            <w:r>
+              <w:rPr>
+                <w:rFonts w:ascii="맑은 고딕" w:hAnsi="맑은 고딕" w:eastAsia="맑은 고딕"/>
+                <w:b w:val="0"/>
+                <w:i w:val="0"/>
+                <w:sz w:val="19"/>
+              </w:rPr>
+              <w:t>Review 1</w:t>
+            </w:r>
+          </w:p>
+        </w:tc>
+        <w:tc>
+          <w:tcPr>
+            <w:tcW w:type="dxa" w:w="1656"/>
+            <w:vAlign w:val="center"/>
+            <w:tcMar>
+              <w:top w:w="100" w:type="dxa"/>
+              <w:bottom w:w="100" w:type="dxa"/>
+              <w:start w:w="120" w:type="dxa"/>
+              <w:end w:w="120" w:type="dxa"/>
+            </w:tcMar>
+          </w:tcPr>
+          <w:p>
+            <w:pPr>
+              <w:keepNext w:val="0"/>
+              <w:spacing w:before="0" w:after="0" w:line="269" w:lineRule="auto"/>
+              <w:jc w:val="center"/>
+            </w:pPr>
+            <w:r/>
+            <w:r>
+              <w:rPr>
+                <w:rFonts w:ascii="맑은 고딕" w:hAnsi="맑은 고딕" w:eastAsia="맑은 고딕"/>
+                <w:b w:val="0"/>
+                <w:i w:val="0"/>
+                <w:sz w:val="19"/>
+              </w:rPr>
+              <w:t>001~010</w:t>
+            </w:r>
+          </w:p>
+        </w:tc>
+        <w:tc>
+          <w:tcPr>
+            <w:tcW w:type="dxa" w:w="5904"/>
+            <w:vAlign w:val="center"/>
+            <w:tcMar>
+              <w:top w:w="100" w:type="dxa"/>
+              <w:bottom w:w="100" w:type="dxa"/>
+              <w:start w:w="120" w:type="dxa"/>
+              <w:end w:w="120" w:type="dxa"/>
+            </w:tcMar>
+          </w:tcPr>
+          <w:p>
+            <w:pPr>
+              <w:keepNext w:val="0"/>
+              <w:spacing w:before="0" w:after="0" w:line="269" w:lineRule="auto"/>
+              <w:jc w:val="left"/>
+            </w:pPr>
+            <w:r/>
+            <w:r>
+              <w:rPr>
+                <w:rFonts w:ascii="맑은 고딕" w:hAnsi="맑은 고딕" w:eastAsia="맑은 고딕"/>
+                <w:b w:val="0"/>
+                <w:i w:val="0"/>
+                <w:sz w:val="19"/>
+              </w:rPr>
+              <w:t>회의 시작·안내·업데이트</w:t>
+            </w:r>
+          </w:p>
+        </w:tc>
+      </w:tr>
+      <w:tr>
+        <w:trPr/>
+        <w:tc>
+          <w:tcPr>
+            <w:tcW w:type="dxa" w:w="1800"/>
+            <w:vAlign w:val="center"/>
+            <w:tcMar>
+              <w:top w:w="100" w:type="dxa"/>
+              <w:bottom w:w="100" w:type="dxa"/>
+              <w:start w:w="120" w:type="dxa"/>
+              <w:end w:w="120" w:type="dxa"/>
+            </w:tcMar>
+          </w:tcPr>
+          <w:p>
+            <w:pPr>
+              <w:keepNext w:val="0"/>
+              <w:spacing w:before="0" w:after="0" w:line="269" w:lineRule="auto"/>
+              <w:jc w:val="center"/>
+            </w:pPr>
+            <w:r/>
+            <w:r>
+              <w:rPr>
+                <w:rFonts w:ascii="맑은 고딕" w:hAnsi="맑은 고딕" w:eastAsia="맑은 고딕"/>
+                <w:b w:val="0"/>
+                <w:i w:val="0"/>
+                <w:sz w:val="19"/>
+              </w:rPr>
+              <w:t>Review 2</w:t>
+            </w:r>
+          </w:p>
+        </w:tc>
+        <w:tc>
+          <w:tcPr>
+            <w:tcW w:type="dxa" w:w="1656"/>
+            <w:vAlign w:val="center"/>
+            <w:tcMar>
+              <w:top w:w="100" w:type="dxa"/>
+              <w:bottom w:w="100" w:type="dxa"/>
+              <w:start w:w="120" w:type="dxa"/>
+              <w:end w:w="120" w:type="dxa"/>
+            </w:tcMar>
+          </w:tcPr>
+          <w:p>
+            <w:pPr>
+              <w:keepNext w:val="0"/>
+              <w:spacing w:before="0" w:after="0" w:line="269" w:lineRule="auto"/>
+              <w:jc w:val="center"/>
+            </w:pPr>
+            <w:r/>
+            <w:r>
+              <w:rPr>
+                <w:rFonts w:ascii="맑은 고딕" w:hAnsi="맑은 고딕" w:eastAsia="맑은 고딕"/>
+                <w:b w:val="0"/>
+                <w:i w:val="0"/>
+                <w:sz w:val="19"/>
+              </w:rPr>
+              <w:t>011~020</w:t>
+            </w:r>
+          </w:p>
+        </w:tc>
+        <w:tc>
+          <w:tcPr>
+            <w:tcW w:type="dxa" w:w="5904"/>
+            <w:vAlign w:val="center"/>
+            <w:tcMar>
+              <w:top w:w="100" w:type="dxa"/>
+              <w:bottom w:w="100" w:type="dxa"/>
+              <w:start w:w="120" w:type="dxa"/>
+              <w:end w:w="120" w:type="dxa"/>
+            </w:tcMar>
+          </w:tcPr>
+          <w:p>
+            <w:pPr>
+              <w:keepNext w:val="0"/>
+              <w:spacing w:before="0" w:after="0" w:line="269" w:lineRule="auto"/>
+              <w:jc w:val="left"/>
+            </w:pPr>
+            <w:r/>
+            <w:r>
+              <w:rPr>
+                <w:rFonts w:ascii="맑은 고딕" w:hAnsi="맑은 고딕" w:eastAsia="맑은 고딕"/>
+                <w:b w:val="0"/>
+                <w:i w:val="0"/>
+                <w:sz w:val="19"/>
+              </w:rPr>
+              <w:t>화상 회의 진행·질문·확인</w:t>
+            </w:r>
+          </w:p>
+        </w:tc>
+      </w:tr>
+      <w:tr>
+        <w:trPr/>
+        <w:tc>
+          <w:tcPr>
+            <w:tcW w:type="dxa" w:w="1800"/>
+            <w:vAlign w:val="center"/>
+            <w:tcMar>
+              <w:top w:w="100" w:type="dxa"/>
+              <w:bottom w:w="100" w:type="dxa"/>
+              <w:start w:w="120" w:type="dxa"/>
+              <w:end w:w="120" w:type="dxa"/>
+            </w:tcMar>
+          </w:tcPr>
+          <w:p>
+            <w:pPr>
+              <w:keepNext w:val="0"/>
+              <w:spacing w:before="0" w:after="0" w:line="269" w:lineRule="auto"/>
+              <w:jc w:val="center"/>
+            </w:pPr>
+            <w:r/>
+            <w:r>
+              <w:rPr>
+                <w:rFonts w:ascii="맑은 고딕" w:hAnsi="맑은 고딕" w:eastAsia="맑은 고딕"/>
+                <w:b w:val="0"/>
+                <w:i w:val="0"/>
+                <w:sz w:val="19"/>
+              </w:rPr>
+              <w:t>Review 3</w:t>
+            </w:r>
+          </w:p>
+        </w:tc>
+        <w:tc>
+          <w:tcPr>
+            <w:tcW w:type="dxa" w:w="1656"/>
+            <w:vAlign w:val="center"/>
+            <w:tcMar>
+              <w:top w:w="100" w:type="dxa"/>
+              <w:bottom w:w="100" w:type="dxa"/>
+              <w:start w:w="120" w:type="dxa"/>
+              <w:end w:w="120" w:type="dxa"/>
+            </w:tcMar>
+          </w:tcPr>
+          <w:p>
+            <w:pPr>
+              <w:keepNext w:val="0"/>
+              <w:spacing w:before="0" w:after="0" w:line="269" w:lineRule="auto"/>
+              <w:jc w:val="center"/>
+            </w:pPr>
+            <w:r/>
+            <w:r>
+              <w:rPr>
+                <w:rFonts w:ascii="맑은 고딕" w:hAnsi="맑은 고딕" w:eastAsia="맑은 고딕"/>
+                <w:b w:val="0"/>
+                <w:i w:val="0"/>
+                <w:sz w:val="19"/>
+              </w:rPr>
+              <w:t>021~025</w:t>
+            </w:r>
+          </w:p>
+        </w:tc>
+        <w:tc>
+          <w:tcPr>
+            <w:tcW w:type="dxa" w:w="5904"/>
+            <w:vAlign w:val="center"/>
+            <w:tcMar>
+              <w:top w:w="100" w:type="dxa"/>
+              <w:bottom w:w="100" w:type="dxa"/>
+              <w:start w:w="120" w:type="dxa"/>
+              <w:end w:w="120" w:type="dxa"/>
+            </w:tcMar>
+          </w:tcPr>
+          <w:p>
+            <w:pPr>
+              <w:keepNext w:val="0"/>
+              <w:spacing w:before="0" w:after="0" w:line="269" w:lineRule="auto"/>
+              <w:jc w:val="left"/>
+            </w:pPr>
+            <w:r/>
+            <w:r>
+              <w:rPr>
+                <w:rFonts w:ascii="맑은 고딕" w:hAnsi="맑은 고딕" w:eastAsia="맑은 고딕"/>
+                <w:b w:val="0"/>
+                <w:i w:val="0"/>
+                <w:sz w:val="19"/>
+              </w:rPr>
+              <w:t>요청·요약·감사·권유</w:t>
+            </w:r>
+          </w:p>
+        </w:tc>
+      </w:tr>
+      <w:tr>
+        <w:trPr/>
+        <w:tc>
+          <w:tcPr>
+            <w:tcW w:type="dxa" w:w="1800"/>
+            <w:vAlign w:val="center"/>
+            <w:tcMar>
+              <w:top w:w="100" w:type="dxa"/>
+              <w:bottom w:w="100" w:type="dxa"/>
+              <w:start w:w="120" w:type="dxa"/>
+              <w:end w:w="120" w:type="dxa"/>
+            </w:tcMar>
+          </w:tcPr>
+          <w:p>
+            <w:pPr>
+              <w:keepNext w:val="0"/>
+              <w:spacing w:before="0" w:after="0" w:line="269" w:lineRule="auto"/>
+              <w:jc w:val="center"/>
+            </w:pPr>
+            <w:r/>
+            <w:r>
+              <w:rPr>
+                <w:rFonts w:ascii="맑은 고딕" w:hAnsi="맑은 고딕" w:eastAsia="맑은 고딕"/>
+                <w:b w:val="0"/>
+                <w:i w:val="0"/>
+                <w:sz w:val="19"/>
+              </w:rPr>
+              <w:t>Review 4</w:t>
+            </w:r>
+          </w:p>
+        </w:tc>
+        <w:tc>
+          <w:tcPr>
+            <w:tcW w:type="dxa" w:w="1656"/>
+            <w:vAlign w:val="center"/>
+            <w:tcMar>
+              <w:top w:w="100" w:type="dxa"/>
+              <w:bottom w:w="100" w:type="dxa"/>
+              <w:start w:w="120" w:type="dxa"/>
+              <w:end w:w="120" w:type="dxa"/>
+            </w:tcMar>
+          </w:tcPr>
+          <w:p>
+            <w:pPr>
+              <w:keepNext w:val="0"/>
+              <w:spacing w:before="0" w:after="0" w:line="269" w:lineRule="auto"/>
+              <w:jc w:val="center"/>
+            </w:pPr>
+            <w:r/>
+            <w:r>
+              <w:rPr>
+                <w:rFonts w:ascii="맑은 고딕" w:hAnsi="맑은 고딕" w:eastAsia="맑은 고딕"/>
+                <w:b w:val="0"/>
+                <w:i w:val="0"/>
+                <w:sz w:val="19"/>
+              </w:rPr>
+              <w:t>026~031</w:t>
+            </w:r>
+          </w:p>
+        </w:tc>
+        <w:tc>
+          <w:tcPr>
+            <w:tcW w:type="dxa" w:w="5904"/>
+            <w:vAlign w:val="center"/>
+            <w:tcMar>
+              <w:top w:w="100" w:type="dxa"/>
+              <w:bottom w:w="100" w:type="dxa"/>
+              <w:start w:w="120" w:type="dxa"/>
+              <w:end w:w="120" w:type="dxa"/>
+            </w:tcMar>
+          </w:tcPr>
+          <w:p>
+            <w:pPr>
+              <w:keepNext w:val="0"/>
+              <w:spacing w:before="0" w:after="0" w:line="269" w:lineRule="auto"/>
+              <w:jc w:val="left"/>
+            </w:pPr>
+            <w:r/>
+            <w:r>
+              <w:rPr>
+                <w:rFonts w:ascii="맑은 고딕" w:hAnsi="맑은 고딕" w:eastAsia="맑은 고딕"/>
+                <w:b w:val="0"/>
+                <w:i w:val="0"/>
+                <w:sz w:val="19"/>
+              </w:rPr>
+              <w:t>기술 문제·고난도 연결 패턴</w:t>
+            </w:r>
+          </w:p>
+        </w:tc>
+      </w:tr>
+    </w:tbl>
+    <w:p>
+      <w:r>
+        <w:br w:type="page"/>
+      </w:r>
+    </w:p>
+    <w:p>
+      <w:pPr>
+        <w:keepNext/>
+        <w:spacing w:before="0" w:after="40" w:line="269" w:lineRule="auto"/>
+      </w:pPr>
+      <w:r>
+        <w:rPr>
+          <w:rFonts w:ascii="맑은 고딕" w:hAnsi="맑은 고딕" w:eastAsia="맑은 고딕"/>
+          <w:b/>
+          <w:i w:val="0"/>
+          <w:color w:val="F47B20"/>
+          <w:sz w:val="36"/>
+        </w:rPr>
+        <w:t>Review 001~010 — Starting and Guiding an Online Meeting</w:t>
+      </w:r>
+    </w:p>
+    <w:p>
+      <w:pPr>
+        <w:keepNext w:val="0"/>
+        <w:spacing w:before="0" w:after="160" w:line="269" w:lineRule="auto"/>
+      </w:pPr>
+      <w:r>
+        <w:rPr>
+          <w:rFonts w:ascii="맑은 고딕" w:hAnsi="맑은 고딕" w:eastAsia="맑은 고딕"/>
+          <w:b w:val="0"/>
+          <w:i/>
+          <w:color w:val="595959"/>
+          <w:sz w:val="20"/>
+        </w:rPr>
+        <w:t>Pattern recall · Fill in the blanks · Guided role-play</w:t>
+      </w:r>
+    </w:p>
+    <w:p>
+      <w:pPr>
+        <w:keepNext w:val="0"/>
+        <w:spacing w:before="0" w:after="160" w:line="269" w:lineRule="auto"/>
+        <w:shd w:fill="FFF2E6"/>
+        <w:ind w:left="173" w:right="173"/>
+      </w:pPr>
+      <w:r>
+        <w:rPr>
+          <w:rFonts w:ascii="맑은 고딕" w:hAnsi="맑은 고딕" w:eastAsia="맑은 고딕"/>
+          <w:b w:val="0"/>
+          <w:i w:val="0"/>
+          <w:color w:val="595959"/>
+          <w:sz w:val="18"/>
+        </w:rPr>
+        <w:t>[ Teaching Guide ] 먼저 한국어 힌트만 보고 말하게 한 뒤, 모범답안과 비교합니다. 완전한 문장보다 목표 패턴을 정확히 시작하는지를 우선 확인하세요.</w:t>
+      </w:r>
+    </w:p>
+    <w:p>
+      <w:pPr>
+        <w:keepNext/>
+        <w:spacing w:before="160" w:after="80" w:line="269" w:lineRule="auto"/>
+      </w:pPr>
+      <w:r>
+        <w:rPr>
+          <w:rFonts w:ascii="맑은 고딕" w:hAnsi="맑은 고딕" w:eastAsia="맑은 고딕"/>
+          <w:b w:val="0"/>
+          <w:i w:val="0"/>
+          <w:color w:val="F47B20"/>
+          <w:sz w:val="28"/>
+        </w:rPr>
+        <w:t>Task 1. Pattern Recall — 한국어를 영어로 말해 보세요.</w:t>
+      </w:r>
+    </w:p>
+    <w:p>
+      <w:pPr>
+        <w:keepNext/>
+        <w:spacing w:before="60" w:after="40" w:line="269" w:lineRule="auto"/>
+        <w:ind w:left="72"/>
+      </w:pPr>
+      <w:r>
+        <w:rPr>
+          <w:rFonts w:ascii="맑은 고딕" w:hAnsi="맑은 고딕" w:eastAsia="맑은 고딕"/>
+          <w:b/>
+          <w:i w:val="0"/>
+          <w:sz w:val="20"/>
+        </w:rPr>
+        <w:t>001  채팅창에 있는 링크를 클릭해 주세요.</w:t>
+      </w:r>
+    </w:p>
+    <w:p>
+      <w:pPr>
+        <w:keepNext w:val="0"/>
+        <w:spacing w:before="0" w:after="120" w:line="269" w:lineRule="auto"/>
+        <w:shd w:fill="EAF4F4"/>
+        <w:ind w:left="173" w:right="173"/>
+      </w:pPr>
+      <w:r>
+        <w:rPr>
+          <w:rFonts w:ascii="맑은 고딕" w:hAnsi="맑은 고딕" w:eastAsia="맑은 고딕"/>
+          <w:b/>
+          <w:i w:val="0"/>
+          <w:color w:val="1F6D70"/>
+          <w:sz w:val="19"/>
+        </w:rPr>
+        <w:t>Model Answer  Please click on the link in the chat box.</w:t>
+      </w:r>
+    </w:p>
+    <w:p>
+      <w:pPr>
+        <w:keepNext/>
+        <w:spacing w:before="60" w:after="40" w:line="269" w:lineRule="auto"/>
+        <w:ind w:left="72"/>
+      </w:pPr>
+      <w:r>
+        <w:rPr>
+          <w:rFonts w:ascii="맑은 고딕" w:hAnsi="맑은 고딕" w:eastAsia="맑은 고딕"/>
+          <w:b/>
+          <w:i w:val="0"/>
+          <w:sz w:val="20"/>
+        </w:rPr>
+        <w:t>002  목요일 교육 세션에 참여해 주세요.</w:t>
+      </w:r>
+    </w:p>
+    <w:p>
+      <w:pPr>
+        <w:keepNext w:val="0"/>
+        <w:spacing w:before="0" w:after="120" w:line="269" w:lineRule="auto"/>
+        <w:shd w:fill="EAF4F4"/>
+        <w:ind w:left="173" w:right="173"/>
+      </w:pPr>
+      <w:r>
+        <w:rPr>
+          <w:rFonts w:ascii="맑은 고딕" w:hAnsi="맑은 고딕" w:eastAsia="맑은 고딕"/>
+          <w:b/>
+          <w:i w:val="0"/>
+          <w:color w:val="1F6D70"/>
+          <w:sz w:val="19"/>
+        </w:rPr>
+        <w:t>Model Answer  Please join the training session on Thursday.</w:t>
+      </w:r>
+    </w:p>
+    <w:p>
+      <w:pPr>
+        <w:keepNext/>
+        <w:spacing w:before="60" w:after="40" w:line="269" w:lineRule="auto"/>
+        <w:ind w:left="72"/>
+      </w:pPr>
+      <w:r>
+        <w:rPr>
+          <w:rFonts w:ascii="맑은 고딕" w:hAnsi="맑은 고딕" w:eastAsia="맑은 고딕"/>
+          <w:b/>
+          <w:i w:val="0"/>
+          <w:sz w:val="20"/>
+        </w:rPr>
+        <w:t>003  내일 아침 회의에 늦지 마세요.</w:t>
+      </w:r>
+    </w:p>
+    <w:p>
+      <w:pPr>
+        <w:keepNext w:val="0"/>
+        <w:spacing w:before="0" w:after="120" w:line="269" w:lineRule="auto"/>
+        <w:shd w:fill="EAF4F4"/>
+        <w:ind w:left="173" w:right="173"/>
+      </w:pPr>
+      <w:r>
+        <w:rPr>
+          <w:rFonts w:ascii="맑은 고딕" w:hAnsi="맑은 고딕" w:eastAsia="맑은 고딕"/>
+          <w:b/>
+          <w:i w:val="0"/>
+          <w:color w:val="1F6D70"/>
+          <w:sz w:val="19"/>
+        </w:rPr>
+        <w:t>Model Answer  Don't be late for the meeting tomorrow morning.</w:t>
+      </w:r>
+    </w:p>
+    <w:p>
+      <w:pPr>
+        <w:keepNext/>
+        <w:spacing w:before="60" w:after="40" w:line="269" w:lineRule="auto"/>
+        <w:ind w:left="72"/>
+      </w:pPr>
+      <w:r>
+        <w:rPr>
+          <w:rFonts w:ascii="맑은 고딕" w:hAnsi="맑은 고딕" w:eastAsia="맑은 고딕"/>
+          <w:b/>
+          <w:i w:val="0"/>
+          <w:sz w:val="20"/>
+        </w:rPr>
+        <w:t>004  저는 오늘 오후 분기 회의에 참석할 예정입니다.</w:t>
+      </w:r>
+    </w:p>
+    <w:p>
+      <w:pPr>
+        <w:keepNext w:val="0"/>
+        <w:spacing w:before="0" w:after="120" w:line="269" w:lineRule="auto"/>
+        <w:shd w:fill="EAF4F4"/>
+        <w:ind w:left="173" w:right="173"/>
+      </w:pPr>
+      <w:r>
+        <w:rPr>
+          <w:rFonts w:ascii="맑은 고딕" w:hAnsi="맑은 고딕" w:eastAsia="맑은 고딕"/>
+          <w:b/>
+          <w:i w:val="0"/>
+          <w:color w:val="1F6D70"/>
+          <w:sz w:val="19"/>
+        </w:rPr>
+        <w:t>Model Answer  I will be attending the quarterly meeting this afternoon.</w:t>
+      </w:r>
+    </w:p>
+    <w:p>
+      <w:pPr>
+        <w:keepNext/>
+        <w:spacing w:before="60" w:after="40" w:line="269" w:lineRule="auto"/>
+        <w:ind w:left="72"/>
+      </w:pPr>
+      <w:r>
+        <w:rPr>
+          <w:rFonts w:ascii="맑은 고딕" w:hAnsi="맑은 고딕" w:eastAsia="맑은 고딕"/>
+          <w:b/>
+          <w:i w:val="0"/>
+          <w:sz w:val="20"/>
+        </w:rPr>
+        <w:t>005  이 회의는 다음 달 일정 변경에 관한 것입니다.</w:t>
+      </w:r>
+    </w:p>
+    <w:p>
+      <w:pPr>
+        <w:keepNext w:val="0"/>
+        <w:spacing w:before="0" w:after="120" w:line="269" w:lineRule="auto"/>
+        <w:shd w:fill="EAF4F4"/>
+        <w:ind w:left="173" w:right="173"/>
+      </w:pPr>
+      <w:r>
+        <w:rPr>
+          <w:rFonts w:ascii="맑은 고딕" w:hAnsi="맑은 고딕" w:eastAsia="맑은 고딕"/>
+          <w:b/>
+          <w:i w:val="0"/>
+          <w:color w:val="1F6D70"/>
+          <w:sz w:val="19"/>
+        </w:rPr>
+        <w:t>Model Answer  This meeting is about the schedule change for next month.</w:t>
+      </w:r>
+    </w:p>
+    <w:p>
+      <w:pPr>
+        <w:keepNext/>
+        <w:spacing w:before="60" w:after="40" w:line="269" w:lineRule="auto"/>
+        <w:ind w:left="72"/>
+      </w:pPr>
+      <w:r>
+        <w:rPr>
+          <w:rFonts w:ascii="맑은 고딕" w:hAnsi="맑은 고딕" w:eastAsia="맑은 고딕"/>
+          <w:b/>
+          <w:i w:val="0"/>
+          <w:sz w:val="20"/>
+        </w:rPr>
+        <w:t>006  배송 일정에 문제가 좀 있습니다.</w:t>
+      </w:r>
+    </w:p>
+    <w:p>
+      <w:pPr>
+        <w:keepNext w:val="0"/>
+        <w:spacing w:before="0" w:after="120" w:line="269" w:lineRule="auto"/>
+        <w:shd w:fill="EAF4F4"/>
+        <w:ind w:left="173" w:right="173"/>
+      </w:pPr>
+      <w:r>
+        <w:rPr>
+          <w:rFonts w:ascii="맑은 고딕" w:hAnsi="맑은 고딕" w:eastAsia="맑은 고딕"/>
+          <w:b/>
+          <w:i w:val="0"/>
+          <w:color w:val="1F6D70"/>
+          <w:sz w:val="19"/>
+        </w:rPr>
+        <w:t>Model Answer  There are issues about the delivery schedule.</w:t>
+      </w:r>
+    </w:p>
+    <w:p>
+      <w:pPr>
+        <w:keepNext/>
+        <w:spacing w:before="60" w:after="40" w:line="269" w:lineRule="auto"/>
+        <w:ind w:left="72"/>
+      </w:pPr>
+      <w:r>
+        <w:rPr>
+          <w:rFonts w:ascii="맑은 고딕" w:hAnsi="맑은 고딕" w:eastAsia="맑은 고딕"/>
+          <w:b/>
+          <w:i w:val="0"/>
+          <w:sz w:val="20"/>
+        </w:rPr>
+        <w:t>007  신입 사원 교육 프로그램에 오신 것을 환영합니다.</w:t>
+      </w:r>
+    </w:p>
+    <w:p>
+      <w:pPr>
+        <w:keepNext w:val="0"/>
+        <w:spacing w:before="0" w:after="120" w:line="269" w:lineRule="auto"/>
+        <w:shd w:fill="EAF4F4"/>
+        <w:ind w:left="173" w:right="173"/>
+      </w:pPr>
+      <w:r>
+        <w:rPr>
+          <w:rFonts w:ascii="맑은 고딕" w:hAnsi="맑은 고딕" w:eastAsia="맑은 고딕"/>
+          <w:b/>
+          <w:i w:val="0"/>
+          <w:color w:val="1F6D70"/>
+          <w:sz w:val="19"/>
+        </w:rPr>
+        <w:t>Model Answer  Welcome to the training program for new employees.</w:t>
+      </w:r>
+    </w:p>
+    <w:p>
+      <w:pPr>
+        <w:keepNext/>
+        <w:spacing w:before="60" w:after="40" w:line="269" w:lineRule="auto"/>
+        <w:ind w:left="72"/>
+      </w:pPr>
+      <w:r>
+        <w:rPr>
+          <w:rFonts w:ascii="맑은 고딕" w:hAnsi="맑은 고딕" w:eastAsia="맑은 고딕"/>
+          <w:b/>
+          <w:i w:val="0"/>
+          <w:sz w:val="20"/>
+        </w:rPr>
+        <w:t>008  프로젝트 진행 상황을 알려 주세요.</w:t>
+      </w:r>
+    </w:p>
+    <w:p>
+      <w:pPr>
+        <w:keepNext w:val="0"/>
+        <w:spacing w:before="0" w:after="120" w:line="269" w:lineRule="auto"/>
+        <w:shd w:fill="EAF4F4"/>
+        <w:ind w:left="173" w:right="173"/>
+      </w:pPr>
+      <w:r>
+        <w:rPr>
+          <w:rFonts w:ascii="맑은 고딕" w:hAnsi="맑은 고딕" w:eastAsia="맑은 고딕"/>
+          <w:b/>
+          <w:i w:val="0"/>
+          <w:color w:val="1F6D70"/>
+          <w:sz w:val="19"/>
+        </w:rPr>
+        <w:t>Model Answer  Please update us on the progress of the project.</w:t>
+      </w:r>
+    </w:p>
+    <w:p>
+      <w:pPr>
+        <w:keepNext/>
+        <w:spacing w:before="60" w:after="40" w:line="269" w:lineRule="auto"/>
+        <w:ind w:left="72"/>
+      </w:pPr>
+      <w:r>
+        <w:rPr>
+          <w:rFonts w:ascii="맑은 고딕" w:hAnsi="맑은 고딕" w:eastAsia="맑은 고딕"/>
+          <w:b/>
+          <w:i w:val="0"/>
+          <w:sz w:val="20"/>
+        </w:rPr>
+        <w:t>009  시간에 유의해 주세요.</w:t>
+      </w:r>
+    </w:p>
+    <w:p>
+      <w:pPr>
+        <w:keepNext w:val="0"/>
+        <w:spacing w:before="0" w:after="120" w:line="269" w:lineRule="auto"/>
+        <w:shd w:fill="EAF4F4"/>
+        <w:ind w:left="173" w:right="173"/>
+      </w:pPr>
+      <w:r>
+        <w:rPr>
+          <w:rFonts w:ascii="맑은 고딕" w:hAnsi="맑은 고딕" w:eastAsia="맑은 고딕"/>
+          <w:b/>
+          <w:i w:val="0"/>
+          <w:color w:val="1F6D70"/>
+          <w:sz w:val="19"/>
+        </w:rPr>
+        <w:t>Model Answer  Please be mindful of the time.</w:t>
+      </w:r>
+    </w:p>
+    <w:p>
+      <w:pPr>
+        <w:keepNext/>
+        <w:spacing w:before="60" w:after="40" w:line="269" w:lineRule="auto"/>
+        <w:ind w:left="72"/>
+      </w:pPr>
+      <w:r>
+        <w:rPr>
+          <w:rFonts w:ascii="맑은 고딕" w:hAnsi="맑은 고딕" w:eastAsia="맑은 고딕"/>
+          <w:b/>
+          <w:i w:val="0"/>
+          <w:sz w:val="20"/>
+        </w:rPr>
+        <w:t>010  회의를 시작하기 전에 참석자를 확인합시다.</w:t>
+      </w:r>
+    </w:p>
+    <w:p>
+      <w:pPr>
+        <w:keepNext w:val="0"/>
+        <w:spacing w:before="0" w:after="120" w:line="269" w:lineRule="auto"/>
+        <w:shd w:fill="EAF4F4"/>
+        <w:ind w:left="173" w:right="173"/>
+      </w:pPr>
+      <w:r>
+        <w:rPr>
+          <w:rFonts w:ascii="맑은 고딕" w:hAnsi="맑은 고딕" w:eastAsia="맑은 고딕"/>
+          <w:b/>
+          <w:i w:val="0"/>
+          <w:color w:val="1F6D70"/>
+          <w:sz w:val="19"/>
+        </w:rPr>
+        <w:t>Model Answer  Before we start the meeting, let's check who is here.</w:t>
+      </w:r>
+    </w:p>
+    <w:p>
+      <w:r>
+        <w:br w:type="page"/>
+      </w:r>
+    </w:p>
+    <w:p>
+      <w:pPr>
+        <w:keepNext/>
+        <w:spacing w:before="0" w:after="140" w:line="269" w:lineRule="auto"/>
+      </w:pPr>
+      <w:r>
+        <w:rPr>
+          <w:rFonts w:ascii="맑은 고딕" w:hAnsi="맑은 고딕" w:eastAsia="맑은 고딕"/>
+          <w:b/>
+          <w:i w:val="0"/>
+          <w:color w:val="F47B20"/>
+          <w:sz w:val="32"/>
+        </w:rPr>
+        <w:t>Review 001~010 — Starting and Guiding an Online Meeting (continued)</w:t>
+      </w:r>
+    </w:p>
+    <w:p>
+      <w:pPr>
+        <w:keepNext/>
+        <w:spacing w:before="160" w:after="80" w:line="269" w:lineRule="auto"/>
+      </w:pPr>
+      <w:r>
+        <w:rPr>
+          <w:rFonts w:ascii="맑은 고딕" w:hAnsi="맑은 고딕" w:eastAsia="맑은 고딕"/>
+          <w:b w:val="0"/>
+          <w:i w:val="0"/>
+          <w:color w:val="F47B20"/>
+          <w:sz w:val="28"/>
+        </w:rPr>
+        <w:t>Task 2. Fill in the Blanks — 알맞은 패턴을 넣어 문장을 완성하세요.</w:t>
+      </w:r>
+    </w:p>
+    <w:p>
+      <w:pPr>
+        <w:keepNext/>
+        <w:spacing w:before="60" w:after="20" w:line="269" w:lineRule="auto"/>
+        <w:ind w:left="72"/>
+      </w:pPr>
+      <w:r>
+        <w:rPr>
+          <w:rFonts w:ascii="맑은 고딕" w:hAnsi="맑은 고딕" w:eastAsia="맑은 고딕"/>
+          <w:b/>
+          <w:i w:val="0"/>
+          <w:sz w:val="20"/>
+        </w:rPr>
+        <w:t>001  발표 자료를 내려받으려면 첨부파일을 클릭해 주세요.</w:t>
+      </w:r>
+    </w:p>
+    <w:p>
+      <w:pPr>
+        <w:keepNext w:val="0"/>
+        <w:spacing w:before="0" w:after="60" w:line="269" w:lineRule="auto"/>
+      </w:pPr>
+      <w:r>
+        <w:rPr>
+          <w:rFonts w:ascii="맑은 고딕" w:hAnsi="맑은 고딕" w:eastAsia="맑은 고딕"/>
+          <w:b w:val="0"/>
+          <w:i w:val="0"/>
+          <w:color w:val="595959"/>
+          <w:sz w:val="20"/>
+        </w:rPr>
+        <w:t>________________________ the attachment to download the presentation.</w:t>
+      </w:r>
+    </w:p>
+    <w:p>
+      <w:pPr>
+        <w:keepNext w:val="0"/>
+        <w:spacing w:before="0" w:after="120" w:line="269" w:lineRule="auto"/>
+        <w:shd w:fill="EAF4F4"/>
+        <w:ind w:left="173" w:right="173"/>
+      </w:pPr>
+      <w:r>
+        <w:rPr>
+          <w:rFonts w:ascii="맑은 고딕" w:hAnsi="맑은 고딕" w:eastAsia="맑은 고딕"/>
+          <w:b/>
+          <w:i w:val="0"/>
+          <w:color w:val="1F6D70"/>
+          <w:sz w:val="19"/>
+        </w:rPr>
+        <w:t>Model Answer  Please click on the attachment to download the presentation.</w:t>
+      </w:r>
+    </w:p>
+    <w:p>
+      <w:pPr>
+        <w:keepNext/>
+        <w:spacing w:before="60" w:after="20" w:line="269" w:lineRule="auto"/>
+        <w:ind w:left="72"/>
+      </w:pPr>
+      <w:r>
+        <w:rPr>
+          <w:rFonts w:ascii="맑은 고딕" w:hAnsi="맑은 고딕" w:eastAsia="맑은 고딕"/>
+          <w:b/>
+          <w:i w:val="0"/>
+          <w:sz w:val="20"/>
+        </w:rPr>
+        <w:t>002  늦지 않게 화상 회의에 들어와 주세요.</w:t>
+      </w:r>
+    </w:p>
+    <w:p>
+      <w:pPr>
+        <w:keepNext w:val="0"/>
+        <w:spacing w:before="0" w:after="60" w:line="269" w:lineRule="auto"/>
+      </w:pPr>
+      <w:r>
+        <w:rPr>
+          <w:rFonts w:ascii="맑은 고딕" w:hAnsi="맑은 고딕" w:eastAsia="맑은 고딕"/>
+          <w:b w:val="0"/>
+          <w:i w:val="0"/>
+          <w:color w:val="595959"/>
+          <w:sz w:val="20"/>
+        </w:rPr>
+        <w:t>________________________ the video call on time.</w:t>
+      </w:r>
+    </w:p>
+    <w:p>
+      <w:pPr>
+        <w:keepNext w:val="0"/>
+        <w:spacing w:before="0" w:after="120" w:line="269" w:lineRule="auto"/>
+        <w:shd w:fill="EAF4F4"/>
+        <w:ind w:left="173" w:right="173"/>
+      </w:pPr>
+      <w:r>
+        <w:rPr>
+          <w:rFonts w:ascii="맑은 고딕" w:hAnsi="맑은 고딕" w:eastAsia="맑은 고딕"/>
+          <w:b/>
+          <w:i w:val="0"/>
+          <w:color w:val="1F6D70"/>
+          <w:sz w:val="19"/>
+        </w:rPr>
+        <w:t>Model Answer  Please join the video call on time.</w:t>
+      </w:r>
+    </w:p>
+    <w:p>
+      <w:pPr>
+        <w:keepNext/>
+        <w:spacing w:before="60" w:after="20" w:line="269" w:lineRule="auto"/>
+        <w:ind w:left="72"/>
+      </w:pPr>
+      <w:r>
+        <w:rPr>
+          <w:rFonts w:ascii="맑은 고딕" w:hAnsi="맑은 고딕" w:eastAsia="맑은 고딕"/>
+          <w:b/>
+          <w:i w:val="0"/>
+          <w:sz w:val="20"/>
+        </w:rPr>
+        <w:t>003  마감 기한에 늦지 않도록 하세요.</w:t>
+      </w:r>
+    </w:p>
+    <w:p>
+      <w:pPr>
+        <w:keepNext w:val="0"/>
+        <w:spacing w:before="0" w:after="60" w:line="269" w:lineRule="auto"/>
+      </w:pPr>
+      <w:r>
+        <w:rPr>
+          <w:rFonts w:ascii="맑은 고딕" w:hAnsi="맑은 고딕" w:eastAsia="맑은 고딕"/>
+          <w:b w:val="0"/>
+          <w:i w:val="0"/>
+          <w:color w:val="595959"/>
+          <w:sz w:val="20"/>
+        </w:rPr>
+        <w:t>________________________ for the deadline.</w:t>
+      </w:r>
+    </w:p>
+    <w:p>
+      <w:pPr>
+        <w:keepNext w:val="0"/>
+        <w:spacing w:before="0" w:after="120" w:line="269" w:lineRule="auto"/>
+        <w:shd w:fill="EAF4F4"/>
+        <w:ind w:left="173" w:right="173"/>
+      </w:pPr>
+      <w:r>
+        <w:rPr>
+          <w:rFonts w:ascii="맑은 고딕" w:hAnsi="맑은 고딕" w:eastAsia="맑은 고딕"/>
+          <w:b/>
+          <w:i w:val="0"/>
+          <w:color w:val="1F6D70"/>
+          <w:sz w:val="19"/>
+        </w:rPr>
+        <w:t>Model Answer  Don't be late for the deadline.</w:t>
+      </w:r>
+    </w:p>
+    <w:p>
+      <w:pPr>
+        <w:keepNext/>
+        <w:spacing w:before="60" w:after="20" w:line="269" w:lineRule="auto"/>
+        <w:ind w:left="72"/>
+      </w:pPr>
+      <w:r>
+        <w:rPr>
+          <w:rFonts w:ascii="맑은 고딕" w:hAnsi="맑은 고딕" w:eastAsia="맑은 고딕"/>
+          <w:b/>
+          <w:i w:val="0"/>
+          <w:sz w:val="20"/>
+        </w:rPr>
+        <w:t>004  다음 주 세미나에 참석할 예정이에요.</w:t>
+      </w:r>
+    </w:p>
+    <w:p>
+      <w:pPr>
+        <w:keepNext w:val="0"/>
+        <w:spacing w:before="0" w:after="60" w:line="269" w:lineRule="auto"/>
+      </w:pPr>
+      <w:r>
+        <w:rPr>
+          <w:rFonts w:ascii="맑은 고딕" w:hAnsi="맑은 고딕" w:eastAsia="맑은 고딕"/>
+          <w:b w:val="0"/>
+          <w:i w:val="0"/>
+          <w:color w:val="595959"/>
+          <w:sz w:val="20"/>
+        </w:rPr>
+        <w:t>________________________ the seminar next week.</w:t>
+      </w:r>
+    </w:p>
+    <w:p>
+      <w:pPr>
+        <w:keepNext w:val="0"/>
+        <w:spacing w:before="0" w:after="120" w:line="269" w:lineRule="auto"/>
+        <w:shd w:fill="EAF4F4"/>
+        <w:ind w:left="173" w:right="173"/>
+      </w:pPr>
+      <w:r>
+        <w:rPr>
+          <w:rFonts w:ascii="맑은 고딕" w:hAnsi="맑은 고딕" w:eastAsia="맑은 고딕"/>
+          <w:b/>
+          <w:i w:val="0"/>
+          <w:color w:val="1F6D70"/>
+          <w:sz w:val="19"/>
+        </w:rPr>
+        <w:t>Model Answer  I will be attending the seminar next week.</w:t>
+      </w:r>
+    </w:p>
+    <w:p>
+      <w:pPr>
+        <w:keepNext/>
+        <w:spacing w:before="60" w:after="20" w:line="269" w:lineRule="auto"/>
+        <w:ind w:left="72"/>
+      </w:pPr>
+      <w:r>
+        <w:rPr>
+          <w:rFonts w:ascii="맑은 고딕" w:hAnsi="맑은 고딕" w:eastAsia="맑은 고딕"/>
+          <w:b/>
+          <w:i w:val="0"/>
+          <w:sz w:val="20"/>
+        </w:rPr>
+        <w:t>005  그 발표는 1분기 판매 실적에 관한 것이었어요.</w:t>
+      </w:r>
+    </w:p>
+    <w:p>
+      <w:pPr>
+        <w:keepNext w:val="0"/>
+        <w:spacing w:before="0" w:after="60" w:line="269" w:lineRule="auto"/>
+      </w:pPr>
+      <w:r>
+        <w:rPr>
+          <w:rFonts w:ascii="맑은 고딕" w:hAnsi="맑은 고딕" w:eastAsia="맑은 고딕"/>
+          <w:b w:val="0"/>
+          <w:i w:val="0"/>
+          <w:color w:val="595959"/>
+          <w:sz w:val="20"/>
+        </w:rPr>
+        <w:t>________________________ the sales results in the first quarter.</w:t>
+      </w:r>
+    </w:p>
+    <w:p>
+      <w:pPr>
+        <w:keepNext w:val="0"/>
+        <w:spacing w:before="0" w:after="120" w:line="269" w:lineRule="auto"/>
+        <w:shd w:fill="EAF4F4"/>
+        <w:ind w:left="173" w:right="173"/>
+      </w:pPr>
+      <w:r>
+        <w:rPr>
+          <w:rFonts w:ascii="맑은 고딕" w:hAnsi="맑은 고딕" w:eastAsia="맑은 고딕"/>
+          <w:b/>
+          <w:i w:val="0"/>
+          <w:color w:val="1F6D70"/>
+          <w:sz w:val="19"/>
+        </w:rPr>
+        <w:t>Model Answer  The presentation was about the sales results in the first quarter.</w:t>
+      </w:r>
+    </w:p>
+    <w:p>
+      <w:pPr>
+        <w:keepNext/>
+        <w:spacing w:before="60" w:after="20" w:line="269" w:lineRule="auto"/>
+        <w:ind w:left="72"/>
+      </w:pPr>
+      <w:r>
+        <w:rPr>
+          <w:rFonts w:ascii="맑은 고딕" w:hAnsi="맑은 고딕" w:eastAsia="맑은 고딕"/>
+          <w:b/>
+          <w:i w:val="0"/>
+          <w:sz w:val="20"/>
+        </w:rPr>
+        <w:t>006  새 디자인에 대해 문제가 제기되고 있어요.</w:t>
+      </w:r>
+    </w:p>
+    <w:p>
+      <w:pPr>
+        <w:keepNext w:val="0"/>
+        <w:spacing w:before="0" w:after="60" w:line="269" w:lineRule="auto"/>
+      </w:pPr>
+      <w:r>
+        <w:rPr>
+          <w:rFonts w:ascii="맑은 고딕" w:hAnsi="맑은 고딕" w:eastAsia="맑은 고딕"/>
+          <w:b w:val="0"/>
+          <w:i w:val="0"/>
+          <w:color w:val="595959"/>
+          <w:sz w:val="20"/>
+        </w:rPr>
+        <w:t>________________________ the new design.</w:t>
+      </w:r>
+    </w:p>
+    <w:p>
+      <w:pPr>
+        <w:keepNext w:val="0"/>
+        <w:spacing w:before="0" w:after="120" w:line="269" w:lineRule="auto"/>
+        <w:shd w:fill="EAF4F4"/>
+        <w:ind w:left="173" w:right="173"/>
+      </w:pPr>
+      <w:r>
+        <w:rPr>
+          <w:rFonts w:ascii="맑은 고딕" w:hAnsi="맑은 고딕" w:eastAsia="맑은 고딕"/>
+          <w:b/>
+          <w:i w:val="0"/>
+          <w:color w:val="1F6D70"/>
+          <w:sz w:val="19"/>
+        </w:rPr>
+        <w:t>Model Answer  There are issues about the new design.</w:t>
+      </w:r>
+    </w:p>
+    <w:p>
+      <w:pPr>
+        <w:keepNext/>
+        <w:spacing w:before="60" w:after="20" w:line="269" w:lineRule="auto"/>
+        <w:ind w:left="72"/>
+      </w:pPr>
+      <w:r>
+        <w:rPr>
+          <w:rFonts w:ascii="맑은 고딕" w:hAnsi="맑은 고딕" w:eastAsia="맑은 고딕"/>
+          <w:b/>
+          <w:i w:val="0"/>
+          <w:sz w:val="20"/>
+        </w:rPr>
+        <w:t>007  저희 주간 회의에 오신 것을 환영합니다.</w:t>
+      </w:r>
+    </w:p>
+    <w:p>
+      <w:pPr>
+        <w:keepNext w:val="0"/>
+        <w:spacing w:before="0" w:after="60" w:line="269" w:lineRule="auto"/>
+      </w:pPr>
+      <w:r>
+        <w:rPr>
+          <w:rFonts w:ascii="맑은 고딕" w:hAnsi="맑은 고딕" w:eastAsia="맑은 고딕"/>
+          <w:b w:val="0"/>
+          <w:i w:val="0"/>
+          <w:color w:val="595959"/>
+          <w:sz w:val="20"/>
+        </w:rPr>
+        <w:t>________________________ our weekly meeting.</w:t>
+      </w:r>
+    </w:p>
+    <w:p>
+      <w:pPr>
+        <w:keepNext w:val="0"/>
+        <w:spacing w:before="0" w:after="120" w:line="269" w:lineRule="auto"/>
+        <w:shd w:fill="EAF4F4"/>
+        <w:ind w:left="173" w:right="173"/>
+      </w:pPr>
+      <w:r>
+        <w:rPr>
+          <w:rFonts w:ascii="맑은 고딕" w:hAnsi="맑은 고딕" w:eastAsia="맑은 고딕"/>
+          <w:b/>
+          <w:i w:val="0"/>
+          <w:color w:val="1F6D70"/>
+          <w:sz w:val="19"/>
+        </w:rPr>
+        <w:t>Model Answer  Welcome to our weekly meeting.</w:t>
+      </w:r>
+    </w:p>
+    <w:p>
+      <w:pPr>
+        <w:keepNext/>
+        <w:spacing w:before="60" w:after="20" w:line="269" w:lineRule="auto"/>
+        <w:ind w:left="72"/>
+      </w:pPr>
+      <w:r>
+        <w:rPr>
+          <w:rFonts w:ascii="맑은 고딕" w:hAnsi="맑은 고딕" w:eastAsia="맑은 고딕"/>
+          <w:b/>
+          <w:i w:val="0"/>
+          <w:sz w:val="20"/>
+        </w:rPr>
+        <w:t>008  내일까지 고객에게 배송 상태를 알려 주세요.</w:t>
+      </w:r>
+    </w:p>
+    <w:p>
+      <w:pPr>
+        <w:keepNext w:val="0"/>
+        <w:spacing w:before="0" w:after="60" w:line="269" w:lineRule="auto"/>
+      </w:pPr>
+      <w:r>
+        <w:rPr>
+          <w:rFonts w:ascii="맑은 고딕" w:hAnsi="맑은 고딕" w:eastAsia="맑은 고딕"/>
+          <w:b w:val="0"/>
+          <w:i w:val="0"/>
+          <w:color w:val="595959"/>
+          <w:sz w:val="20"/>
+        </w:rPr>
+        <w:t>________________________ the client on the delivery status by tomorrow.</w:t>
+      </w:r>
+    </w:p>
+    <w:p>
+      <w:pPr>
+        <w:keepNext w:val="0"/>
+        <w:spacing w:before="0" w:after="120" w:line="269" w:lineRule="auto"/>
+        <w:shd w:fill="EAF4F4"/>
+        <w:ind w:left="173" w:right="173"/>
+      </w:pPr>
+      <w:r>
+        <w:rPr>
+          <w:rFonts w:ascii="맑은 고딕" w:hAnsi="맑은 고딕" w:eastAsia="맑은 고딕"/>
+          <w:b/>
+          <w:i w:val="0"/>
+          <w:color w:val="1F6D70"/>
+          <w:sz w:val="19"/>
+        </w:rPr>
+        <w:t>Model Answer  Please update the client on the delivery status by tomorrow.</w:t>
+      </w:r>
+    </w:p>
+    <w:p>
+      <w:pPr>
+        <w:keepNext/>
+        <w:spacing w:before="60" w:after="20" w:line="269" w:lineRule="auto"/>
+        <w:ind w:left="72"/>
+      </w:pPr>
+      <w:r>
+        <w:rPr>
+          <w:rFonts w:ascii="맑은 고딕" w:hAnsi="맑은 고딕" w:eastAsia="맑은 고딕"/>
+          <w:b/>
+          <w:i w:val="0"/>
+          <w:sz w:val="20"/>
+        </w:rPr>
+        <w:t>009  회의실을 예약할 때 다른 팀들을 배려해 주세요.</w:t>
+      </w:r>
+    </w:p>
+    <w:p>
+      <w:pPr>
+        <w:keepNext w:val="0"/>
+        <w:spacing w:before="0" w:after="60" w:line="269" w:lineRule="auto"/>
+      </w:pPr>
+      <w:r>
+        <w:rPr>
+          <w:rFonts w:ascii="맑은 고딕" w:hAnsi="맑은 고딕" w:eastAsia="맑은 고딕"/>
+          <w:b w:val="0"/>
+          <w:i w:val="0"/>
+          <w:color w:val="595959"/>
+          <w:sz w:val="20"/>
+        </w:rPr>
+        <w:t>________________________ other teams when you book the meeting room.</w:t>
+      </w:r>
+    </w:p>
+    <w:p>
+      <w:pPr>
+        <w:keepNext w:val="0"/>
+        <w:spacing w:before="0" w:after="120" w:line="269" w:lineRule="auto"/>
+        <w:shd w:fill="EAF4F4"/>
+        <w:ind w:left="173" w:right="173"/>
+      </w:pPr>
+      <w:r>
+        <w:rPr>
+          <w:rFonts w:ascii="맑은 고딕" w:hAnsi="맑은 고딕" w:eastAsia="맑은 고딕"/>
+          <w:b/>
+          <w:i w:val="0"/>
+          <w:color w:val="1F6D70"/>
+          <w:sz w:val="19"/>
+        </w:rPr>
+        <w:t>Model Answer  Please be mindful of other teams when you book the meeting room.</w:t>
+      </w:r>
+    </w:p>
+    <w:p>
+      <w:pPr>
+        <w:keepNext/>
+        <w:spacing w:before="60" w:after="20" w:line="269" w:lineRule="auto"/>
+        <w:ind w:left="72"/>
+      </w:pPr>
+      <w:r>
+        <w:rPr>
+          <w:rFonts w:ascii="맑은 고딕" w:hAnsi="맑은 고딕" w:eastAsia="맑은 고딕"/>
+          <w:b/>
+          <w:i w:val="0"/>
+          <w:sz w:val="20"/>
+        </w:rPr>
+        <w:t>010  논의를 시작하기 전에 배경을 설명드릴게요.</w:t>
+      </w:r>
+    </w:p>
+    <w:p>
+      <w:pPr>
+        <w:keepNext w:val="0"/>
+        <w:spacing w:before="0" w:after="60" w:line="269" w:lineRule="auto"/>
+      </w:pPr>
+      <w:r>
+        <w:rPr>
+          <w:rFonts w:ascii="맑은 고딕" w:hAnsi="맑은 고딕" w:eastAsia="맑은 고딕"/>
+          <w:b w:val="0"/>
+          <w:i w:val="0"/>
+          <w:color w:val="595959"/>
+          <w:sz w:val="20"/>
+        </w:rPr>
+        <w:t>________________________ the discussion, let me explain the background.</w:t>
+      </w:r>
+    </w:p>
+    <w:p>
+      <w:pPr>
+        <w:keepNext w:val="0"/>
+        <w:spacing w:before="0" w:after="120" w:line="269" w:lineRule="auto"/>
+        <w:shd w:fill="EAF4F4"/>
+        <w:ind w:left="173" w:right="173"/>
+      </w:pPr>
+      <w:r>
+        <w:rPr>
+          <w:rFonts w:ascii="맑은 고딕" w:hAnsi="맑은 고딕" w:eastAsia="맑은 고딕"/>
+          <w:b/>
+          <w:i w:val="0"/>
+          <w:color w:val="1F6D70"/>
+          <w:sz w:val="19"/>
+        </w:rPr>
+        <w:t>Model Answer  Before we start the discussion, let me explain the background.</w:t>
+      </w:r>
+    </w:p>
+    <w:p>
+      <w:r>
+        <w:br w:type="page"/>
+      </w:r>
+    </w:p>
+    <w:p>
+      <w:pPr>
+        <w:keepNext/>
+        <w:spacing w:before="0" w:after="140" w:line="269" w:lineRule="auto"/>
+      </w:pPr>
+      <w:r>
+        <w:rPr>
+          <w:rFonts w:ascii="맑은 고딕" w:hAnsi="맑은 고딕" w:eastAsia="맑은 고딕"/>
+          <w:b/>
+          <w:i w:val="0"/>
+          <w:color w:val="F47B20"/>
+          <w:sz w:val="32"/>
+        </w:rPr>
+        <w:t>Review 001~010 — Starting and Guiding an Online Meeting — Speaking Activity</w:t>
+      </w:r>
+    </w:p>
+    <w:p>
+      <w:pPr>
+        <w:keepNext/>
+        <w:spacing w:before="160" w:after="80" w:line="269" w:lineRule="auto"/>
+      </w:pPr>
+      <w:r>
+        <w:rPr>
+          <w:rFonts w:ascii="맑은 고딕" w:hAnsi="맑은 고딕" w:eastAsia="맑은 고딕"/>
+          <w:b w:val="0"/>
+          <w:i w:val="0"/>
+          <w:color w:val="F47B20"/>
+          <w:sz w:val="28"/>
+        </w:rPr>
+        <w:t>Task 3. Guided Role-Play — 상황에 맞게 대화를 완성하세요.</w:t>
+      </w:r>
+    </w:p>
+    <w:p>
+      <w:pPr>
+        <w:keepNext/>
+        <w:spacing w:before="100" w:after="80" w:line="269" w:lineRule="auto"/>
+        <w:shd w:fill="F7F7F7"/>
+        <w:ind w:left="144" w:right="144"/>
+      </w:pPr>
+      <w:r>
+        <w:rPr>
+          <w:rFonts w:ascii="맑은 고딕" w:hAnsi="맑은 고딕" w:eastAsia="맑은 고딕"/>
+          <w:b/>
+          <w:i w:val="0"/>
+          <w:sz w:val="20"/>
+        </w:rPr>
+        <w:t>Situation 1  온라인 프로젝트 킥오프를 시작하세요. 참가자에게 링크를 클릭하고 회의에 참여하도록 안내하세요.</w:t>
+      </w:r>
+    </w:p>
+    <w:p>
+      <w:pPr>
+        <w:keepNext w:val="0"/>
+        <w:spacing w:before="0" w:after="120" w:line="269" w:lineRule="auto"/>
+        <w:shd w:fill="EAF4F4"/>
+        <w:ind w:left="173" w:right="173"/>
+      </w:pPr>
+      <w:r>
+        <w:rPr>
+          <w:rFonts w:ascii="맑은 고딕" w:hAnsi="맑은 고딕" w:eastAsia="맑은 고딕"/>
+          <w:b/>
+          <w:i w:val="0"/>
+          <w:color w:val="1F6D70"/>
+          <w:sz w:val="19"/>
+        </w:rPr>
+        <w:t>Model Answer  A: Welcome to our online project kickoff. Please click on the link in the chat box.</w:t>
+      </w:r>
+    </w:p>
+    <w:p>
+      <w:pPr>
+        <w:keepNext w:val="0"/>
+        <w:spacing w:before="0" w:after="120" w:line="269" w:lineRule="auto"/>
+        <w:shd w:fill="EAF4F4"/>
+        <w:ind w:left="173" w:right="173"/>
+      </w:pPr>
+      <w:r>
+        <w:rPr>
+          <w:rFonts w:ascii="맑은 고딕" w:hAnsi="맑은 고딕" w:eastAsia="맑은 고딕"/>
+          <w:b/>
+          <w:i w:val="0"/>
+          <w:color w:val="1F6D70"/>
+          <w:sz w:val="19"/>
+        </w:rPr>
+        <w:t>Model Answer  B: Got it. I will join the shared workspace now.</w:t>
+      </w:r>
+    </w:p>
+    <w:p>
+      <w:pPr>
+        <w:keepNext w:val="0"/>
+        <w:spacing w:before="0" w:after="120" w:line="269" w:lineRule="auto"/>
+        <w:shd w:fill="EAF4F4"/>
+        <w:ind w:left="173" w:right="173"/>
+      </w:pPr>
+      <w:r>
+        <w:rPr>
+          <w:rFonts w:ascii="맑은 고딕" w:hAnsi="맑은 고딕" w:eastAsia="맑은 고딕"/>
+          <w:b/>
+          <w:i w:val="0"/>
+          <w:color w:val="1F6D70"/>
+          <w:sz w:val="19"/>
+        </w:rPr>
+        <w:t>Model Answer  A: Before we start, please mute your microphone when you are not speaking.</w:t>
+      </w:r>
+    </w:p>
+    <w:p>
+      <w:pPr>
+        <w:keepNext/>
+        <w:spacing w:before="100" w:after="80" w:line="269" w:lineRule="auto"/>
+        <w:shd w:fill="F7F7F7"/>
+        <w:ind w:left="144" w:right="144"/>
+      </w:pPr>
+      <w:r>
+        <w:rPr>
+          <w:rFonts w:ascii="맑은 고딕" w:hAnsi="맑은 고딕" w:eastAsia="맑은 고딕"/>
+          <w:b/>
+          <w:i w:val="0"/>
+          <w:sz w:val="20"/>
+        </w:rPr>
+        <w:t>Situation 2  진행 상황과 일정 문제를 설명하고 팀에 최신 정보를 요청하세요.</w:t>
+      </w:r>
+    </w:p>
+    <w:p>
+      <w:pPr>
+        <w:keepNext w:val="0"/>
+        <w:spacing w:before="0" w:after="120" w:line="269" w:lineRule="auto"/>
+        <w:shd w:fill="EAF4F4"/>
+        <w:ind w:left="173" w:right="173"/>
+      </w:pPr>
+      <w:r>
+        <w:rPr>
+          <w:rFonts w:ascii="맑은 고딕" w:hAnsi="맑은 고딕" w:eastAsia="맑은 고딕"/>
+          <w:b/>
+          <w:i w:val="0"/>
+          <w:color w:val="1F6D70"/>
+          <w:sz w:val="19"/>
+        </w:rPr>
+        <w:t>Model Answer  A: Today's meeting is about our project timeline.</w:t>
+      </w:r>
+    </w:p>
+    <w:p>
+      <w:pPr>
+        <w:keepNext w:val="0"/>
+        <w:spacing w:before="0" w:after="120" w:line="269" w:lineRule="auto"/>
+        <w:shd w:fill="EAF4F4"/>
+        <w:ind w:left="173" w:right="173"/>
+      </w:pPr>
+      <w:r>
+        <w:rPr>
+          <w:rFonts w:ascii="맑은 고딕" w:hAnsi="맑은 고딕" w:eastAsia="맑은 고딕"/>
+          <w:b/>
+          <w:i w:val="0"/>
+          <w:color w:val="1F6D70"/>
+          <w:sz w:val="19"/>
+        </w:rPr>
+        <w:t>Model Answer  B: Are there any issues about the delivery schedule?</w:t>
+      </w:r>
+    </w:p>
+    <w:p>
+      <w:pPr>
+        <w:keepNext w:val="0"/>
+        <w:spacing w:before="0" w:after="120" w:line="269" w:lineRule="auto"/>
+        <w:shd w:fill="EAF4F4"/>
+        <w:ind w:left="173" w:right="173"/>
+      </w:pPr>
+      <w:r>
+        <w:rPr>
+          <w:rFonts w:ascii="맑은 고딕" w:hAnsi="맑은 고딕" w:eastAsia="맑은 고딕"/>
+          <w:b/>
+          <w:i w:val="0"/>
+          <w:color w:val="1F6D70"/>
+          <w:sz w:val="19"/>
+        </w:rPr>
+        <w:t>Model Answer  A: Yes. Please update the team on any changes by Friday.</w:t>
+      </w:r>
+    </w:p>
+    <w:p>
+      <w:pPr>
+        <w:keepNext/>
+        <w:spacing w:before="160" w:after="80" w:line="269" w:lineRule="auto"/>
+      </w:pPr>
+      <w:r>
+        <w:rPr>
+          <w:rFonts w:ascii="맑은 고딕" w:hAnsi="맑은 고딕" w:eastAsia="맑은 고딕"/>
+          <w:b w:val="0"/>
+          <w:i w:val="0"/>
+          <w:color w:val="F47B20"/>
+          <w:sz w:val="28"/>
+        </w:rPr>
+        <w:t>Self-Check</w:t>
+      </w:r>
+    </w:p>
+    <w:p>
+      <w:pPr>
+        <w:keepNext w:val="0"/>
+        <w:spacing w:before="0" w:after="80" w:line="269" w:lineRule="auto"/>
+      </w:pPr>
+      <w:r>
+        <w:rPr>
+          <w:rFonts w:ascii="맑은 고딕" w:hAnsi="맑은 고딕" w:eastAsia="맑은 고딕"/>
+          <w:b w:val="0"/>
+          <w:i w:val="0"/>
+          <w:sz w:val="20"/>
+        </w:rPr>
+        <w:t>☐  목표 패턴으로 문장을 시작했나요?</w:t>
+      </w:r>
+    </w:p>
+    <w:p>
+      <w:pPr>
+        <w:keepNext w:val="0"/>
+        <w:spacing w:before="0" w:after="80" w:line="269" w:lineRule="auto"/>
+      </w:pPr>
+      <w:r>
+        <w:rPr>
+          <w:rFonts w:ascii="맑은 고딕" w:hAnsi="맑은 고딕" w:eastAsia="맑은 고딕"/>
+          <w:b w:val="0"/>
+          <w:i w:val="0"/>
+          <w:sz w:val="20"/>
+        </w:rPr>
+        <w:t>☐  회의 상황에 맞는 어휘와 정중한 어조를 사용했나요?</w:t>
+      </w:r>
+    </w:p>
+    <w:p>
+      <w:pPr>
+        <w:keepNext w:val="0"/>
+        <w:spacing w:before="0" w:after="80" w:line="269" w:lineRule="auto"/>
+      </w:pPr>
+      <w:r>
+        <w:rPr>
+          <w:rFonts w:ascii="맑은 고딕" w:hAnsi="맑은 고딕" w:eastAsia="맑은 고딕"/>
+          <w:b w:val="0"/>
+          <w:i w:val="0"/>
+          <w:sz w:val="20"/>
+        </w:rPr>
+        <w:t>☐  문장을 보지 않고 한 번 더 말할 수 있나요?</w:t>
+      </w:r>
+    </w:p>
+    <w:p>
+      <w:r>
+        <w:br w:type="page"/>
+      </w:r>
+    </w:p>
+    <w:p>
+      <w:pPr>
+        <w:keepNext/>
+        <w:spacing w:before="0" w:after="40" w:line="269" w:lineRule="auto"/>
+      </w:pPr>
+      <w:r>
+        <w:rPr>
+          <w:rFonts w:ascii="맑은 고딕" w:hAnsi="맑은 고딕" w:eastAsia="맑은 고딕"/>
+          <w:b/>
+          <w:i w:val="0"/>
+          <w:color w:val="F47B20"/>
+          <w:sz w:val="36"/>
+        </w:rPr>
+        <w:t>Review 011~020 — Running the Meeting Smoothly</w:t>
+      </w:r>
+    </w:p>
+    <w:p>
+      <w:pPr>
+        <w:keepNext w:val="0"/>
+        <w:spacing w:before="0" w:after="160" w:line="269" w:lineRule="auto"/>
+      </w:pPr>
+      <w:r>
+        <w:rPr>
+          <w:rFonts w:ascii="맑은 고딕" w:hAnsi="맑은 고딕" w:eastAsia="맑은 고딕"/>
+          <w:b w:val="0"/>
+          <w:i/>
+          <w:color w:val="595959"/>
+          <w:sz w:val="20"/>
+        </w:rPr>
+        <w:t>Pattern recall · Fill in the blanks · Guided role-play</w:t>
+      </w:r>
+    </w:p>
+    <w:p>
+      <w:pPr>
+        <w:keepNext w:val="0"/>
+        <w:spacing w:before="0" w:after="160" w:line="269" w:lineRule="auto"/>
+        <w:shd w:fill="FFF2E6"/>
+        <w:ind w:left="173" w:right="173"/>
+      </w:pPr>
+      <w:r>
+        <w:rPr>
+          <w:rFonts w:ascii="맑은 고딕" w:hAnsi="맑은 고딕" w:eastAsia="맑은 고딕"/>
+          <w:b w:val="0"/>
+          <w:i w:val="0"/>
+          <w:color w:val="595959"/>
+          <w:sz w:val="18"/>
+        </w:rPr>
+        <w:t>[ Teaching Guide ] 먼저 한국어 힌트만 보고 말하게 한 뒤, 모범답안과 비교합니다. 완전한 문장보다 목표 패턴을 정확히 시작하는지를 우선 확인하세요.</w:t>
+      </w:r>
+    </w:p>
+    <w:p>
+      <w:pPr>
+        <w:keepNext/>
+        <w:spacing w:before="160" w:after="80" w:line="269" w:lineRule="auto"/>
+      </w:pPr>
+      <w:r>
+        <w:rPr>
+          <w:rFonts w:ascii="맑은 고딕" w:hAnsi="맑은 고딕" w:eastAsia="맑은 고딕"/>
+          <w:b w:val="0"/>
+          <w:i w:val="0"/>
+          <w:color w:val="F47B20"/>
+          <w:sz w:val="28"/>
+        </w:rPr>
+        <w:t>Task 1. Pattern Recall — 한국어를 영어로 말해 보세요.</w:t>
+      </w:r>
+    </w:p>
+    <w:p>
+      <w:pPr>
+        <w:keepNext/>
+        <w:spacing w:before="60" w:after="40" w:line="269" w:lineRule="auto"/>
+        <w:ind w:left="72"/>
+      </w:pPr>
+      <w:r>
+        <w:rPr>
+          <w:rFonts w:ascii="맑은 고딕" w:hAnsi="맑은 고딕" w:eastAsia="맑은 고딕"/>
+          <w:b/>
+          <w:i w:val="0"/>
+          <w:sz w:val="20"/>
+        </w:rPr>
+        <w:t>011  제 화면 보이시나요?</w:t>
+      </w:r>
+    </w:p>
+    <w:p>
+      <w:pPr>
+        <w:keepNext w:val="0"/>
+        <w:spacing w:before="0" w:after="120" w:line="269" w:lineRule="auto"/>
+        <w:shd w:fill="EAF4F4"/>
+        <w:ind w:left="173" w:right="173"/>
+      </w:pPr>
+      <w:r>
+        <w:rPr>
+          <w:rFonts w:ascii="맑은 고딕" w:hAnsi="맑은 고딕" w:eastAsia="맑은 고딕"/>
+          <w:b/>
+          <w:i w:val="0"/>
+          <w:color w:val="1F6D70"/>
+          <w:sz w:val="19"/>
+        </w:rPr>
+        <w:t>Model Answer  Can you see my screen?</w:t>
+      </w:r>
+    </w:p>
+    <w:p>
+      <w:pPr>
+        <w:keepNext/>
+        <w:spacing w:before="60" w:after="40" w:line="269" w:lineRule="auto"/>
+        <w:ind w:left="72"/>
+      </w:pPr>
+      <w:r>
+        <w:rPr>
+          <w:rFonts w:ascii="맑은 고딕" w:hAnsi="맑은 고딕" w:eastAsia="맑은 고딕"/>
+          <w:b/>
+          <w:i w:val="0"/>
+          <w:sz w:val="20"/>
+        </w:rPr>
+        <w:t>012  회의는 한 시간 정도 걸릴 예정입니다.</w:t>
+      </w:r>
+    </w:p>
+    <w:p>
+      <w:pPr>
+        <w:keepNext w:val="0"/>
+        <w:spacing w:before="0" w:after="120" w:line="269" w:lineRule="auto"/>
+        <w:shd w:fill="EAF4F4"/>
+        <w:ind w:left="173" w:right="173"/>
+      </w:pPr>
+      <w:r>
+        <w:rPr>
+          <w:rFonts w:ascii="맑은 고딕" w:hAnsi="맑은 고딕" w:eastAsia="맑은 고딕"/>
+          <w:b/>
+          <w:i w:val="0"/>
+          <w:color w:val="1F6D70"/>
+          <w:sz w:val="19"/>
+        </w:rPr>
+        <w:t>Model Answer  The meeting is going to last about an hour.</w:t>
+      </w:r>
+    </w:p>
+    <w:p>
+      <w:pPr>
+        <w:keepNext/>
+        <w:spacing w:before="60" w:after="40" w:line="269" w:lineRule="auto"/>
+        <w:ind w:left="72"/>
+      </w:pPr>
+      <w:r>
+        <w:rPr>
+          <w:rFonts w:ascii="맑은 고딕" w:hAnsi="맑은 고딕" w:eastAsia="맑은 고딕"/>
+          <w:b/>
+          <w:i w:val="0"/>
+          <w:sz w:val="20"/>
+        </w:rPr>
+        <w:t>013  언제든지 질문하는 것을 주저하지 마세요.</w:t>
+      </w:r>
+    </w:p>
+    <w:p>
+      <w:pPr>
+        <w:keepNext w:val="0"/>
+        <w:spacing w:before="0" w:after="120" w:line="269" w:lineRule="auto"/>
+        <w:shd w:fill="EAF4F4"/>
+        <w:ind w:left="173" w:right="173"/>
+      </w:pPr>
+      <w:r>
+        <w:rPr>
+          <w:rFonts w:ascii="맑은 고딕" w:hAnsi="맑은 고딕" w:eastAsia="맑은 고딕"/>
+          <w:b/>
+          <w:i w:val="0"/>
+          <w:color w:val="1F6D70"/>
+          <w:sz w:val="19"/>
+        </w:rPr>
+        <w:t>Model Answer  Don't hesitate to ask questions at any time.</w:t>
+      </w:r>
+    </w:p>
+    <w:p>
+      <w:pPr>
+        <w:keepNext/>
+        <w:spacing w:before="60" w:after="40" w:line="269" w:lineRule="auto"/>
+        <w:ind w:left="72"/>
+      </w:pPr>
+      <w:r>
+        <w:rPr>
+          <w:rFonts w:ascii="맑은 고딕" w:hAnsi="맑은 고딕" w:eastAsia="맑은 고딕"/>
+          <w:b/>
+          <w:i w:val="0"/>
+          <w:sz w:val="20"/>
+        </w:rPr>
+        <w:t>014  제 화면을 공유하겠습니다.</w:t>
+      </w:r>
+    </w:p>
+    <w:p>
+      <w:pPr>
+        <w:keepNext w:val="0"/>
+        <w:spacing w:before="0" w:after="120" w:line="269" w:lineRule="auto"/>
+        <w:shd w:fill="EAF4F4"/>
+        <w:ind w:left="173" w:right="173"/>
+      </w:pPr>
+      <w:r>
+        <w:rPr>
+          <w:rFonts w:ascii="맑은 고딕" w:hAnsi="맑은 고딕" w:eastAsia="맑은 고딕"/>
+          <w:b/>
+          <w:i w:val="0"/>
+          <w:color w:val="1F6D70"/>
+          <w:sz w:val="19"/>
+        </w:rPr>
+        <w:t>Model Answer  Let me share my screen.</w:t>
+      </w:r>
+    </w:p>
+    <w:p>
+      <w:pPr>
+        <w:keepNext/>
+        <w:spacing w:before="60" w:after="40" w:line="269" w:lineRule="auto"/>
+        <w:ind w:left="72"/>
+      </w:pPr>
+      <w:r>
+        <w:rPr>
+          <w:rFonts w:ascii="맑은 고딕" w:hAnsi="맑은 고딕" w:eastAsia="맑은 고딕"/>
+          <w:b/>
+          <w:i w:val="0"/>
+          <w:sz w:val="20"/>
+        </w:rPr>
+        <w:t>015  회의를 녹화해도 될까요?</w:t>
+      </w:r>
+    </w:p>
+    <w:p>
+      <w:pPr>
+        <w:keepNext w:val="0"/>
+        <w:spacing w:before="0" w:after="120" w:line="269" w:lineRule="auto"/>
+        <w:shd w:fill="EAF4F4"/>
+        <w:ind w:left="173" w:right="173"/>
+      </w:pPr>
+      <w:r>
+        <w:rPr>
+          <w:rFonts w:ascii="맑은 고딕" w:hAnsi="맑은 고딕" w:eastAsia="맑은 고딕"/>
+          <w:b/>
+          <w:i w:val="0"/>
+          <w:color w:val="1F6D70"/>
+          <w:sz w:val="19"/>
+        </w:rPr>
+        <w:t>Model Answer  Would you mind if I recorded this meeting?</w:t>
+      </w:r>
+    </w:p>
+    <w:p>
+      <w:pPr>
+        <w:keepNext/>
+        <w:spacing w:before="60" w:after="40" w:line="269" w:lineRule="auto"/>
+        <w:ind w:left="72"/>
+      </w:pPr>
+      <w:r>
+        <w:rPr>
+          <w:rFonts w:ascii="맑은 고딕" w:hAnsi="맑은 고딕" w:eastAsia="맑은 고딕"/>
+          <w:b/>
+          <w:i w:val="0"/>
+          <w:sz w:val="20"/>
+        </w:rPr>
+        <w:t>016  잠깐 끼어들어도 될까요?</w:t>
+      </w:r>
+    </w:p>
+    <w:p>
+      <w:pPr>
+        <w:keepNext w:val="0"/>
+        <w:spacing w:before="0" w:after="120" w:line="269" w:lineRule="auto"/>
+        <w:shd w:fill="EAF4F4"/>
+        <w:ind w:left="173" w:right="173"/>
+      </w:pPr>
+      <w:r>
+        <w:rPr>
+          <w:rFonts w:ascii="맑은 고딕" w:hAnsi="맑은 고딕" w:eastAsia="맑은 고딕"/>
+          <w:b/>
+          <w:i w:val="0"/>
+          <w:color w:val="1F6D70"/>
+          <w:sz w:val="19"/>
+        </w:rPr>
+        <w:t>Model Answer  Could I interrupt you for a second?</w:t>
+      </w:r>
+    </w:p>
+    <w:p>
+      <w:pPr>
+        <w:keepNext/>
+        <w:spacing w:before="60" w:after="40" w:line="269" w:lineRule="auto"/>
+        <w:ind w:left="72"/>
+      </w:pPr>
+      <w:r>
+        <w:rPr>
+          <w:rFonts w:ascii="맑은 고딕" w:hAnsi="맑은 고딕" w:eastAsia="맑은 고딕"/>
+          <w:b/>
+          <w:i w:val="0"/>
+          <w:sz w:val="20"/>
+        </w:rPr>
+        <w:t>017  오늘 모든 내용을 다룰 시간이 없는 것 같네요.</w:t>
+      </w:r>
+    </w:p>
+    <w:p>
+      <w:pPr>
+        <w:keepNext w:val="0"/>
+        <w:spacing w:before="0" w:after="120" w:line="269" w:lineRule="auto"/>
+        <w:shd w:fill="EAF4F4"/>
+        <w:ind w:left="173" w:right="173"/>
+      </w:pPr>
+      <w:r>
+        <w:rPr>
+          <w:rFonts w:ascii="맑은 고딕" w:hAnsi="맑은 고딕" w:eastAsia="맑은 고딕"/>
+          <w:b/>
+          <w:i w:val="0"/>
+          <w:color w:val="1F6D70"/>
+          <w:sz w:val="19"/>
+        </w:rPr>
+        <w:t>Model Answer  We don't seem to have enough time to cover everything today.</w:t>
+      </w:r>
+    </w:p>
+    <w:p>
+      <w:pPr>
+        <w:keepNext/>
+        <w:spacing w:before="60" w:after="40" w:line="269" w:lineRule="auto"/>
+        <w:ind w:left="72"/>
+      </w:pPr>
+      <w:r>
+        <w:rPr>
+          <w:rFonts w:ascii="맑은 고딕" w:hAnsi="맑은 고딕" w:eastAsia="맑은 고딕"/>
+          <w:b/>
+          <w:i w:val="0"/>
+          <w:sz w:val="20"/>
+        </w:rPr>
+        <w:t>018  이전 슬라이드로 돌아가도 될까요?</w:t>
+      </w:r>
+    </w:p>
+    <w:p>
+      <w:pPr>
+        <w:keepNext w:val="0"/>
+        <w:spacing w:before="0" w:after="120" w:line="269" w:lineRule="auto"/>
+        <w:shd w:fill="EAF4F4"/>
+        <w:ind w:left="173" w:right="173"/>
+      </w:pPr>
+      <w:r>
+        <w:rPr>
+          <w:rFonts w:ascii="맑은 고딕" w:hAnsi="맑은 고딕" w:eastAsia="맑은 고딕"/>
+          <w:b/>
+          <w:i w:val="0"/>
+          <w:color w:val="1F6D70"/>
+          <w:sz w:val="19"/>
+        </w:rPr>
+        <w:t>Model Answer  Can we go back to the previous slide?</w:t>
+      </w:r>
+    </w:p>
+    <w:p>
+      <w:pPr>
+        <w:keepNext/>
+        <w:spacing w:before="60" w:after="40" w:line="269" w:lineRule="auto"/>
+        <w:ind w:left="72"/>
+      </w:pPr>
+      <w:r>
+        <w:rPr>
+          <w:rFonts w:ascii="맑은 고딕" w:hAnsi="맑은 고딕" w:eastAsia="맑은 고딕"/>
+          <w:b/>
+          <w:i w:val="0"/>
+          <w:sz w:val="20"/>
+        </w:rPr>
+        <w:t>019  마감을 일주일 미루는 것을 고려해 보셨나요?</w:t>
+      </w:r>
+    </w:p>
+    <w:p>
+      <w:pPr>
+        <w:keepNext w:val="0"/>
+        <w:spacing w:before="0" w:after="120" w:line="269" w:lineRule="auto"/>
+        <w:shd w:fill="EAF4F4"/>
+        <w:ind w:left="173" w:right="173"/>
+      </w:pPr>
+      <w:r>
+        <w:rPr>
+          <w:rFonts w:ascii="맑은 고딕" w:hAnsi="맑은 고딕" w:eastAsia="맑은 고딕"/>
+          <w:b/>
+          <w:i w:val="0"/>
+          <w:color w:val="1F6D70"/>
+          <w:sz w:val="19"/>
+        </w:rPr>
+        <w:t>Model Answer  Have you considered moving the deadline by one week?</w:t>
+      </w:r>
+    </w:p>
+    <w:p>
+      <w:pPr>
+        <w:keepNext/>
+        <w:spacing w:before="60" w:after="40" w:line="269" w:lineRule="auto"/>
+        <w:ind w:left="72"/>
+      </w:pPr>
+      <w:r>
+        <w:rPr>
+          <w:rFonts w:ascii="맑은 고딕" w:hAnsi="맑은 고딕" w:eastAsia="맑은 고딕"/>
+          <w:b/>
+          <w:i w:val="0"/>
+          <w:sz w:val="20"/>
+        </w:rPr>
+        <w:t>020  새 승인 절차가 헷갈려요.</w:t>
+      </w:r>
+    </w:p>
+    <w:p>
+      <w:pPr>
+        <w:keepNext w:val="0"/>
+        <w:spacing w:before="0" w:after="120" w:line="269" w:lineRule="auto"/>
+        <w:shd w:fill="EAF4F4"/>
+        <w:ind w:left="173" w:right="173"/>
+      </w:pPr>
+      <w:r>
+        <w:rPr>
+          <w:rFonts w:ascii="맑은 고딕" w:hAnsi="맑은 고딕" w:eastAsia="맑은 고딕"/>
+          <w:b/>
+          <w:i w:val="0"/>
+          <w:color w:val="1F6D70"/>
+          <w:sz w:val="19"/>
+        </w:rPr>
+        <w:t>Model Answer  I'm confused about the new approval process.</w:t>
+      </w:r>
+    </w:p>
+    <w:p>
+      <w:r>
+        <w:br w:type="page"/>
+      </w:r>
+    </w:p>
+    <w:p>
+      <w:pPr>
+        <w:keepNext/>
+        <w:spacing w:before="0" w:after="140" w:line="269" w:lineRule="auto"/>
+      </w:pPr>
+      <w:r>
+        <w:rPr>
+          <w:rFonts w:ascii="맑은 고딕" w:hAnsi="맑은 고딕" w:eastAsia="맑은 고딕"/>
+          <w:b/>
+          <w:i w:val="0"/>
+          <w:color w:val="F47B20"/>
+          <w:sz w:val="32"/>
+        </w:rPr>
+        <w:t>Review 011~020 — Running the Meeting Smoothly (continued)</w:t>
+      </w:r>
+    </w:p>
+    <w:p>
+      <w:pPr>
+        <w:keepNext/>
+        <w:spacing w:before="160" w:after="80" w:line="269" w:lineRule="auto"/>
+      </w:pPr>
+      <w:r>
+        <w:rPr>
+          <w:rFonts w:ascii="맑은 고딕" w:hAnsi="맑은 고딕" w:eastAsia="맑은 고딕"/>
+          <w:b w:val="0"/>
+          <w:i w:val="0"/>
+          <w:color w:val="F47B20"/>
+          <w:sz w:val="28"/>
+        </w:rPr>
+        <w:t>Task 2. Fill in the Blanks — 알맞은 패턴을 넣어 문장을 완성하세요.</w:t>
+      </w:r>
+    </w:p>
+    <w:p>
+      <w:pPr>
+        <w:keepNext/>
+        <w:spacing w:before="60" w:after="20" w:line="269" w:lineRule="auto"/>
+        <w:ind w:left="72"/>
+      </w:pPr>
+      <w:r>
+        <w:rPr>
+          <w:rFonts w:ascii="맑은 고딕" w:hAnsi="맑은 고딕" w:eastAsia="맑은 고딕"/>
+          <w:b/>
+          <w:i w:val="0"/>
+          <w:sz w:val="20"/>
+        </w:rPr>
+        <w:t>011  5페이지 도표가 보이시나요?</w:t>
+      </w:r>
+    </w:p>
+    <w:p>
+      <w:pPr>
+        <w:keepNext w:val="0"/>
+        <w:spacing w:before="0" w:after="60" w:line="269" w:lineRule="auto"/>
+      </w:pPr>
+      <w:r>
+        <w:rPr>
+          <w:rFonts w:ascii="맑은 고딕" w:hAnsi="맑은 고딕" w:eastAsia="맑은 고딕"/>
+          <w:b w:val="0"/>
+          <w:i w:val="0"/>
+          <w:color w:val="595959"/>
+          <w:sz w:val="20"/>
+        </w:rPr>
+        <w:t>________________________ the chart on page five?</w:t>
+      </w:r>
+    </w:p>
+    <w:p>
+      <w:pPr>
+        <w:keepNext w:val="0"/>
+        <w:spacing w:before="0" w:after="120" w:line="269" w:lineRule="auto"/>
+        <w:shd w:fill="EAF4F4"/>
+        <w:ind w:left="173" w:right="173"/>
+      </w:pPr>
+      <w:r>
+        <w:rPr>
+          <w:rFonts w:ascii="맑은 고딕" w:hAnsi="맑은 고딕" w:eastAsia="맑은 고딕"/>
+          <w:b/>
+          <w:i w:val="0"/>
+          <w:color w:val="1F6D70"/>
+          <w:sz w:val="19"/>
+        </w:rPr>
+        <w:t>Model Answer  Can you see the chart on page five?</w:t>
+      </w:r>
+    </w:p>
+    <w:p>
+      <w:pPr>
+        <w:keepNext/>
+        <w:spacing w:before="60" w:after="20" w:line="269" w:lineRule="auto"/>
+        <w:ind w:left="72"/>
+      </w:pPr>
+      <w:r>
+        <w:rPr>
+          <w:rFonts w:ascii="맑은 고딕" w:hAnsi="맑은 고딕" w:eastAsia="맑은 고딕"/>
+          <w:b/>
+          <w:i w:val="0"/>
+          <w:sz w:val="20"/>
+        </w:rPr>
+        <w:t>012  워크숍은 이틀 동안 진행될 거예요.</w:t>
+      </w:r>
+    </w:p>
+    <w:p>
+      <w:pPr>
+        <w:keepNext w:val="0"/>
+        <w:spacing w:before="0" w:after="60" w:line="269" w:lineRule="auto"/>
+      </w:pPr>
+      <w:r>
+        <w:rPr>
+          <w:rFonts w:ascii="맑은 고딕" w:hAnsi="맑은 고딕" w:eastAsia="맑은 고딕"/>
+          <w:b w:val="0"/>
+          <w:i w:val="0"/>
+          <w:color w:val="595959"/>
+          <w:sz w:val="20"/>
+        </w:rPr>
+        <w:t>________________________ to last two days.</w:t>
+      </w:r>
+    </w:p>
+    <w:p>
+      <w:pPr>
+        <w:keepNext w:val="0"/>
+        <w:spacing w:before="0" w:after="120" w:line="269" w:lineRule="auto"/>
+        <w:shd w:fill="EAF4F4"/>
+        <w:ind w:left="173" w:right="173"/>
+      </w:pPr>
+      <w:r>
+        <w:rPr>
+          <w:rFonts w:ascii="맑은 고딕" w:hAnsi="맑은 고딕" w:eastAsia="맑은 고딕"/>
+          <w:b/>
+          <w:i w:val="0"/>
+          <w:color w:val="1F6D70"/>
+          <w:sz w:val="19"/>
+        </w:rPr>
+        <w:t>Model Answer  The workshop is going to last two days.</w:t>
+      </w:r>
+    </w:p>
+    <w:p>
+      <w:pPr>
+        <w:keepNext/>
+        <w:spacing w:before="60" w:after="20" w:line="269" w:lineRule="auto"/>
+        <w:ind w:left="72"/>
+      </w:pPr>
+      <w:r>
+        <w:rPr>
+          <w:rFonts w:ascii="맑은 고딕" w:hAnsi="맑은 고딕" w:eastAsia="맑은 고딕"/>
+          <w:b/>
+          <w:i w:val="0"/>
+          <w:sz w:val="20"/>
+        </w:rPr>
+        <w:t>013  문제가 있으면 주저하지 말고 연락 주세요.</w:t>
+      </w:r>
+    </w:p>
+    <w:p>
+      <w:pPr>
+        <w:keepNext w:val="0"/>
+        <w:spacing w:before="0" w:after="60" w:line="269" w:lineRule="auto"/>
+      </w:pPr>
+      <w:r>
+        <w:rPr>
+          <w:rFonts w:ascii="맑은 고딕" w:hAnsi="맑은 고딕" w:eastAsia="맑은 고딕"/>
+          <w:b w:val="0"/>
+          <w:i w:val="0"/>
+          <w:color w:val="595959"/>
+          <w:sz w:val="20"/>
+        </w:rPr>
+        <w:t>________________________ to contact me if there is a problem.</w:t>
+      </w:r>
+    </w:p>
+    <w:p>
+      <w:pPr>
+        <w:keepNext w:val="0"/>
+        <w:spacing w:before="0" w:after="120" w:line="269" w:lineRule="auto"/>
+        <w:shd w:fill="EAF4F4"/>
+        <w:ind w:left="173" w:right="173"/>
+      </w:pPr>
+      <w:r>
+        <w:rPr>
+          <w:rFonts w:ascii="맑은 고딕" w:hAnsi="맑은 고딕" w:eastAsia="맑은 고딕"/>
+          <w:b/>
+          <w:i w:val="0"/>
+          <w:color w:val="1F6D70"/>
+          <w:sz w:val="19"/>
+        </w:rPr>
+        <w:t>Model Answer  Don't hesitate to contact me if there is a problem.</w:t>
+      </w:r>
+    </w:p>
+    <w:p>
+      <w:pPr>
+        <w:keepNext/>
+        <w:spacing w:before="60" w:after="20" w:line="269" w:lineRule="auto"/>
+        <w:ind w:left="72"/>
+      </w:pPr>
+      <w:r>
+        <w:rPr>
+          <w:rFonts w:ascii="맑은 고딕" w:hAnsi="맑은 고딕" w:eastAsia="맑은 고딕"/>
+          <w:b/>
+          <w:i w:val="0"/>
+          <w:sz w:val="20"/>
+        </w:rPr>
+        <w:t>014  회의가 끝난 후 회의록을 공유해 드릴게요.</w:t>
+      </w:r>
+    </w:p>
+    <w:p>
+      <w:pPr>
+        <w:keepNext w:val="0"/>
+        <w:spacing w:before="0" w:after="60" w:line="269" w:lineRule="auto"/>
+      </w:pPr>
+      <w:r>
+        <w:rPr>
+          <w:rFonts w:ascii="맑은 고딕" w:hAnsi="맑은 고딕" w:eastAsia="맑은 고딕"/>
+          <w:b w:val="0"/>
+          <w:i w:val="0"/>
+          <w:color w:val="595959"/>
+          <w:sz w:val="20"/>
+        </w:rPr>
+        <w:t>________________________ the meeting notes after the meeting.</w:t>
+      </w:r>
+    </w:p>
+    <w:p>
+      <w:pPr>
+        <w:keepNext w:val="0"/>
+        <w:spacing w:before="0" w:after="120" w:line="269" w:lineRule="auto"/>
+        <w:shd w:fill="EAF4F4"/>
+        <w:ind w:left="173" w:right="173"/>
+      </w:pPr>
+      <w:r>
+        <w:rPr>
+          <w:rFonts w:ascii="맑은 고딕" w:hAnsi="맑은 고딕" w:eastAsia="맑은 고딕"/>
+          <w:b/>
+          <w:i w:val="0"/>
+          <w:color w:val="1F6D70"/>
+          <w:sz w:val="19"/>
+        </w:rPr>
+        <w:t>Model Answer  Let me share the meeting notes after the meeting.</w:t>
+      </w:r>
+    </w:p>
+    <w:p>
+      <w:pPr>
+        <w:keepNext/>
+        <w:spacing w:before="60" w:after="20" w:line="269" w:lineRule="auto"/>
+        <w:ind w:left="72"/>
+      </w:pPr>
+      <w:r>
+        <w:rPr>
+          <w:rFonts w:ascii="맑은 고딕" w:hAnsi="맑은 고딕" w:eastAsia="맑은 고딕"/>
+          <w:b/>
+          <w:i w:val="0"/>
+          <w:sz w:val="20"/>
+        </w:rPr>
+        <w:t>015  다음 안건으로 넘어가도 될까요?</w:t>
+      </w:r>
+    </w:p>
+    <w:p>
+      <w:pPr>
+        <w:keepNext w:val="0"/>
+        <w:spacing w:before="0" w:after="60" w:line="269" w:lineRule="auto"/>
+      </w:pPr>
+      <w:r>
+        <w:rPr>
+          <w:rFonts w:ascii="맑은 고딕" w:hAnsi="맑은 고딕" w:eastAsia="맑은 고딕"/>
+          <w:b w:val="0"/>
+          <w:i w:val="0"/>
+          <w:color w:val="595959"/>
+          <w:sz w:val="20"/>
+        </w:rPr>
+        <w:t>________________________ we moved on to the next agenda item?</w:t>
+      </w:r>
+    </w:p>
+    <w:p>
+      <w:pPr>
+        <w:keepNext w:val="0"/>
+        <w:spacing w:before="0" w:after="120" w:line="269" w:lineRule="auto"/>
+        <w:shd w:fill="EAF4F4"/>
+        <w:ind w:left="173" w:right="173"/>
+      </w:pPr>
+      <w:r>
+        <w:rPr>
+          <w:rFonts w:ascii="맑은 고딕" w:hAnsi="맑은 고딕" w:eastAsia="맑은 고딕"/>
+          <w:b/>
+          <w:i w:val="0"/>
+          <w:color w:val="1F6D70"/>
+          <w:sz w:val="19"/>
+        </w:rPr>
+        <w:t>Model Answer  Would you mind if we moved on to the next agenda item?</w:t>
+      </w:r>
+    </w:p>
+    <w:p>
+      <w:pPr>
+        <w:keepNext/>
+        <w:spacing w:before="60" w:after="20" w:line="269" w:lineRule="auto"/>
+        <w:ind w:left="72"/>
+      </w:pPr>
+      <w:r>
+        <w:rPr>
+          <w:rFonts w:ascii="맑은 고딕" w:hAnsi="맑은 고딕" w:eastAsia="맑은 고딕"/>
+          <w:b/>
+          <w:i w:val="0"/>
+          <w:sz w:val="20"/>
+        </w:rPr>
+        <w:t>016  중요한 내용을 하나 추가하기 위해 잠시 끼어들어도 될까요?</w:t>
+      </w:r>
+    </w:p>
+    <w:p>
+      <w:pPr>
+        <w:keepNext w:val="0"/>
+        <w:spacing w:before="0" w:after="60" w:line="269" w:lineRule="auto"/>
+      </w:pPr>
+      <w:r>
+        <w:rPr>
+          <w:rFonts w:ascii="맑은 고딕" w:hAnsi="맑은 고딕" w:eastAsia="맑은 고딕"/>
+          <w:b w:val="0"/>
+          <w:i w:val="0"/>
+          <w:color w:val="595959"/>
+          <w:sz w:val="20"/>
+        </w:rPr>
+        <w:t>________________________ to add one important point?</w:t>
+      </w:r>
+    </w:p>
+    <w:p>
+      <w:pPr>
+        <w:keepNext w:val="0"/>
+        <w:spacing w:before="0" w:after="120" w:line="269" w:lineRule="auto"/>
+        <w:shd w:fill="EAF4F4"/>
+        <w:ind w:left="173" w:right="173"/>
+      </w:pPr>
+      <w:r>
+        <w:rPr>
+          <w:rFonts w:ascii="맑은 고딕" w:hAnsi="맑은 고딕" w:eastAsia="맑은 고딕"/>
+          <w:b/>
+          <w:i w:val="0"/>
+          <w:color w:val="1F6D70"/>
+          <w:sz w:val="19"/>
+        </w:rPr>
+        <w:t>Model Answer  Could I interrupt you to add one important point?</w:t>
+      </w:r>
+    </w:p>
+    <w:p>
+      <w:pPr>
+        <w:keepNext/>
+        <w:spacing w:before="60" w:after="20" w:line="269" w:lineRule="auto"/>
+        <w:ind w:left="72"/>
+      </w:pPr>
+      <w:r>
+        <w:rPr>
+          <w:rFonts w:ascii="맑은 고딕" w:hAnsi="맑은 고딕" w:eastAsia="맑은 고딕"/>
+          <w:b/>
+          <w:i w:val="0"/>
+          <w:sz w:val="20"/>
+        </w:rPr>
+        <w:t>017  아직 핵심에 대해 합의가 안 된 것 같아요.</w:t>
+      </w:r>
+    </w:p>
+    <w:p>
+      <w:pPr>
+        <w:keepNext w:val="0"/>
+        <w:spacing w:before="0" w:after="60" w:line="269" w:lineRule="auto"/>
+      </w:pPr>
+      <w:r>
+        <w:rPr>
+          <w:rFonts w:ascii="맑은 고딕" w:hAnsi="맑은 고딕" w:eastAsia="맑은 고딕"/>
+          <w:b w:val="0"/>
+          <w:i w:val="0"/>
+          <w:color w:val="595959"/>
+          <w:sz w:val="20"/>
+        </w:rPr>
+        <w:t>________________________ agree on the main point yet.</w:t>
+      </w:r>
+    </w:p>
+    <w:p>
+      <w:pPr>
+        <w:keepNext w:val="0"/>
+        <w:spacing w:before="0" w:after="120" w:line="269" w:lineRule="auto"/>
+        <w:shd w:fill="EAF4F4"/>
+        <w:ind w:left="173" w:right="173"/>
+      </w:pPr>
+      <w:r>
+        <w:rPr>
+          <w:rFonts w:ascii="맑은 고딕" w:hAnsi="맑은 고딕" w:eastAsia="맑은 고딕"/>
+          <w:b/>
+          <w:i w:val="0"/>
+          <w:color w:val="1F6D70"/>
+          <w:sz w:val="19"/>
+        </w:rPr>
+        <w:t>Model Answer  We don't seem to agree on the main point yet.</w:t>
+      </w:r>
+    </w:p>
+    <w:p>
+      <w:pPr>
+        <w:keepNext/>
+        <w:spacing w:before="60" w:after="20" w:line="269" w:lineRule="auto"/>
+        <w:ind w:left="72"/>
+      </w:pPr>
+      <w:r>
+        <w:rPr>
+          <w:rFonts w:ascii="맑은 고딕" w:hAnsi="맑은 고딕" w:eastAsia="맑은 고딕"/>
+          <w:b/>
+          <w:i w:val="0"/>
+          <w:sz w:val="20"/>
+        </w:rPr>
+        <w:t>018  아까 논의했던 예산 문제로 돌아갈 수 있을까요?</w:t>
+      </w:r>
+    </w:p>
+    <w:p>
+      <w:pPr>
+        <w:keepNext w:val="0"/>
+        <w:spacing w:before="0" w:after="60" w:line="269" w:lineRule="auto"/>
+      </w:pPr>
+      <w:r>
+        <w:rPr>
+          <w:rFonts w:ascii="맑은 고딕" w:hAnsi="맑은 고딕" w:eastAsia="맑은 고딕"/>
+          <w:b w:val="0"/>
+          <w:i w:val="0"/>
+          <w:color w:val="595959"/>
+          <w:sz w:val="20"/>
+        </w:rPr>
+        <w:t>________________________ to the budget issue we discussed earlier?</w:t>
+      </w:r>
+    </w:p>
+    <w:p>
+      <w:pPr>
+        <w:keepNext w:val="0"/>
+        <w:spacing w:before="0" w:after="120" w:line="269" w:lineRule="auto"/>
+        <w:shd w:fill="EAF4F4"/>
+        <w:ind w:left="173" w:right="173"/>
+      </w:pPr>
+      <w:r>
+        <w:rPr>
+          <w:rFonts w:ascii="맑은 고딕" w:hAnsi="맑은 고딕" w:eastAsia="맑은 고딕"/>
+          <w:b/>
+          <w:i w:val="0"/>
+          <w:color w:val="1F6D70"/>
+          <w:sz w:val="19"/>
+        </w:rPr>
+        <w:t>Model Answer  Can we go back to the budget issue we discussed earlier?</w:t>
+      </w:r>
+    </w:p>
+    <w:p>
+      <w:pPr>
+        <w:keepNext/>
+        <w:spacing w:before="60" w:after="20" w:line="269" w:lineRule="auto"/>
+        <w:ind w:left="72"/>
+      </w:pPr>
+      <w:r>
+        <w:rPr>
+          <w:rFonts w:ascii="맑은 고딕" w:hAnsi="맑은 고딕" w:eastAsia="맑은 고딕"/>
+          <w:b/>
+          <w:i w:val="0"/>
+          <w:sz w:val="20"/>
+        </w:rPr>
+        <w:t>019  더 간단한 도구를 쓰는 건 어때요?</w:t>
+      </w:r>
+    </w:p>
+    <w:p>
+      <w:pPr>
+        <w:keepNext w:val="0"/>
+        <w:spacing w:before="0" w:after="60" w:line="269" w:lineRule="auto"/>
+      </w:pPr>
+      <w:r>
+        <w:rPr>
+          <w:rFonts w:ascii="맑은 고딕" w:hAnsi="맑은 고딕" w:eastAsia="맑은 고딕"/>
+          <w:b w:val="0"/>
+          <w:i w:val="0"/>
+          <w:color w:val="595959"/>
+          <w:sz w:val="20"/>
+        </w:rPr>
+        <w:t>________________________ using a simpler tool?</w:t>
+      </w:r>
+    </w:p>
+    <w:p>
+      <w:pPr>
+        <w:keepNext w:val="0"/>
+        <w:spacing w:before="0" w:after="120" w:line="269" w:lineRule="auto"/>
+        <w:shd w:fill="EAF4F4"/>
+        <w:ind w:left="173" w:right="173"/>
+      </w:pPr>
+      <w:r>
+        <w:rPr>
+          <w:rFonts w:ascii="맑은 고딕" w:hAnsi="맑은 고딕" w:eastAsia="맑은 고딕"/>
+          <w:b/>
+          <w:i w:val="0"/>
+          <w:color w:val="1F6D70"/>
+          <w:sz w:val="19"/>
+        </w:rPr>
+        <w:t>Model Answer  Have you considered using a simpler tool?</w:t>
+      </w:r>
+    </w:p>
+    <w:p>
+      <w:pPr>
+        <w:keepNext/>
+        <w:spacing w:before="60" w:after="20" w:line="269" w:lineRule="auto"/>
+        <w:ind w:left="72"/>
+      </w:pPr>
+      <w:r>
+        <w:rPr>
+          <w:rFonts w:ascii="맑은 고딕" w:hAnsi="맑은 고딕" w:eastAsia="맑은 고딕"/>
+          <w:b/>
+          <w:i w:val="0"/>
+          <w:sz w:val="20"/>
+        </w:rPr>
+        <w:t>020  이 업무의 담당자가 누구인지 헷갈립니다.</w:t>
+      </w:r>
+    </w:p>
+    <w:p>
+      <w:pPr>
+        <w:keepNext w:val="0"/>
+        <w:spacing w:before="0" w:after="60" w:line="269" w:lineRule="auto"/>
+      </w:pPr>
+      <w:r>
+        <w:rPr>
+          <w:rFonts w:ascii="맑은 고딕" w:hAnsi="맑은 고딕" w:eastAsia="맑은 고딕"/>
+          <w:b w:val="0"/>
+          <w:i w:val="0"/>
+          <w:color w:val="595959"/>
+          <w:sz w:val="20"/>
+        </w:rPr>
+        <w:t>________________________ who is in charge of this task.</w:t>
+      </w:r>
+    </w:p>
+    <w:p>
+      <w:pPr>
+        <w:keepNext w:val="0"/>
+        <w:spacing w:before="0" w:after="120" w:line="269" w:lineRule="auto"/>
+        <w:shd w:fill="EAF4F4"/>
+        <w:ind w:left="173" w:right="173"/>
+      </w:pPr>
+      <w:r>
+        <w:rPr>
+          <w:rFonts w:ascii="맑은 고딕" w:hAnsi="맑은 고딕" w:eastAsia="맑은 고딕"/>
+          <w:b/>
+          <w:i w:val="0"/>
+          <w:color w:val="1F6D70"/>
+          <w:sz w:val="19"/>
+        </w:rPr>
+        <w:t>Model Answer  I'm confused about who is in charge of this task.</w:t>
+      </w:r>
+    </w:p>
+    <w:p>
+      <w:r>
+        <w:br w:type="page"/>
+      </w:r>
+    </w:p>
+    <w:p>
+      <w:pPr>
+        <w:keepNext/>
+        <w:spacing w:before="0" w:after="140" w:line="269" w:lineRule="auto"/>
+      </w:pPr>
+      <w:r>
+        <w:rPr>
+          <w:rFonts w:ascii="맑은 고딕" w:hAnsi="맑은 고딕" w:eastAsia="맑은 고딕"/>
+          <w:b/>
+          <w:i w:val="0"/>
+          <w:color w:val="F47B20"/>
+          <w:sz w:val="32"/>
+        </w:rPr>
+        <w:t>Review 011~020 — Running the Meeting Smoothly — Speaking Activity</w:t>
+      </w:r>
+    </w:p>
+    <w:p>
+      <w:pPr>
+        <w:keepNext/>
+        <w:spacing w:before="160" w:after="80" w:line="269" w:lineRule="auto"/>
+      </w:pPr>
+      <w:r>
+        <w:rPr>
+          <w:rFonts w:ascii="맑은 고딕" w:hAnsi="맑은 고딕" w:eastAsia="맑은 고딕"/>
+          <w:b w:val="0"/>
+          <w:i w:val="0"/>
+          <w:color w:val="F47B20"/>
+          <w:sz w:val="28"/>
+        </w:rPr>
+        <w:t>Task 3. Guided Role-Play — 상황에 맞게 대화를 완성하세요.</w:t>
+      </w:r>
+    </w:p>
+    <w:p>
+      <w:pPr>
+        <w:keepNext/>
+        <w:spacing w:before="100" w:after="80" w:line="269" w:lineRule="auto"/>
+        <w:shd w:fill="F7F7F7"/>
+        <w:ind w:left="144" w:right="144"/>
+      </w:pPr>
+      <w:r>
+        <w:rPr>
+          <w:rFonts w:ascii="맑은 고딕" w:hAnsi="맑은 고딕" w:eastAsia="맑은 고딕"/>
+          <w:b/>
+          <w:i w:val="0"/>
+          <w:sz w:val="20"/>
+        </w:rPr>
+        <w:t>Situation 1  화면 공유가 잘 보이지 않는 상황에서 정중히 끼어들고 이전 슬라이드로 돌아가 달라고 요청하세요.</w:t>
+      </w:r>
+    </w:p>
+    <w:p>
+      <w:pPr>
+        <w:keepNext w:val="0"/>
+        <w:spacing w:before="0" w:after="120" w:line="269" w:lineRule="auto"/>
+        <w:shd w:fill="EAF4F4"/>
+        <w:ind w:left="173" w:right="173"/>
+      </w:pPr>
+      <w:r>
+        <w:rPr>
+          <w:rFonts w:ascii="맑은 고딕" w:hAnsi="맑은 고딕" w:eastAsia="맑은 고딕"/>
+          <w:b/>
+          <w:i w:val="0"/>
+          <w:color w:val="1F6D70"/>
+          <w:sz w:val="19"/>
+        </w:rPr>
+        <w:t>Model Answer  A: Could I interrupt you for a moment? I can't see the chart clearly.</w:t>
+      </w:r>
+    </w:p>
+    <w:p>
+      <w:pPr>
+        <w:keepNext w:val="0"/>
+        <w:spacing w:before="0" w:after="120" w:line="269" w:lineRule="auto"/>
+        <w:shd w:fill="EAF4F4"/>
+        <w:ind w:left="173" w:right="173"/>
+      </w:pPr>
+      <w:r>
+        <w:rPr>
+          <w:rFonts w:ascii="맑은 고딕" w:hAnsi="맑은 고딕" w:eastAsia="맑은 고딕"/>
+          <w:b/>
+          <w:i w:val="0"/>
+          <w:color w:val="1F6D70"/>
+          <w:sz w:val="19"/>
+        </w:rPr>
+        <w:t>Model Answer  B: Of course. Can you see it now?</w:t>
+      </w:r>
+    </w:p>
+    <w:p>
+      <w:pPr>
+        <w:keepNext w:val="0"/>
+        <w:spacing w:before="0" w:after="120" w:line="269" w:lineRule="auto"/>
+        <w:shd w:fill="EAF4F4"/>
+        <w:ind w:left="173" w:right="173"/>
+      </w:pPr>
+      <w:r>
+        <w:rPr>
+          <w:rFonts w:ascii="맑은 고딕" w:hAnsi="맑은 고딕" w:eastAsia="맑은 고딕"/>
+          <w:b/>
+          <w:i w:val="0"/>
+          <w:color w:val="1F6D70"/>
+          <w:sz w:val="19"/>
+        </w:rPr>
+        <w:t>Model Answer  A: Yes, thanks. Can we go back to the previous slide?</w:t>
+      </w:r>
+    </w:p>
+    <w:p>
+      <w:pPr>
+        <w:keepNext/>
+        <w:spacing w:before="100" w:after="80" w:line="269" w:lineRule="auto"/>
+        <w:shd w:fill="F7F7F7"/>
+        <w:ind w:left="144" w:right="144"/>
+      </w:pPr>
+      <w:r>
+        <w:rPr>
+          <w:rFonts w:ascii="맑은 고딕" w:hAnsi="맑은 고딕" w:eastAsia="맑은 고딕"/>
+          <w:b/>
+          <w:i w:val="0"/>
+          <w:sz w:val="20"/>
+        </w:rPr>
+        <w:t>Situation 2  회의가 길어지는 상황에서 질문과 제안을 주고받으세요.</w:t>
+      </w:r>
+    </w:p>
+    <w:p>
+      <w:pPr>
+        <w:keepNext w:val="0"/>
+        <w:spacing w:before="0" w:after="120" w:line="269" w:lineRule="auto"/>
+        <w:shd w:fill="EAF4F4"/>
+        <w:ind w:left="173" w:right="173"/>
+      </w:pPr>
+      <w:r>
+        <w:rPr>
+          <w:rFonts w:ascii="맑은 고딕" w:hAnsi="맑은 고딕" w:eastAsia="맑은 고딕"/>
+          <w:b/>
+          <w:i w:val="0"/>
+          <w:color w:val="1F6D70"/>
+          <w:sz w:val="19"/>
+        </w:rPr>
+        <w:t>Model Answer  A: The meeting is going to last a little longer than expected.</w:t>
+      </w:r>
+    </w:p>
+    <w:p>
+      <w:pPr>
+        <w:keepNext w:val="0"/>
+        <w:spacing w:before="0" w:after="120" w:line="269" w:lineRule="auto"/>
+        <w:shd w:fill="EAF4F4"/>
+        <w:ind w:left="173" w:right="173"/>
+      </w:pPr>
+      <w:r>
+        <w:rPr>
+          <w:rFonts w:ascii="맑은 고딕" w:hAnsi="맑은 고딕" w:eastAsia="맑은 고딕"/>
+          <w:b/>
+          <w:i w:val="0"/>
+          <w:color w:val="1F6D70"/>
+          <w:sz w:val="19"/>
+        </w:rPr>
+        <w:t>Model Answer  B: I understand. Would you mind if we took a five-minute break?</w:t>
+      </w:r>
+    </w:p>
+    <w:p>
+      <w:pPr>
+        <w:keepNext w:val="0"/>
+        <w:spacing w:before="0" w:after="120" w:line="269" w:lineRule="auto"/>
+        <w:shd w:fill="EAF4F4"/>
+        <w:ind w:left="173" w:right="173"/>
+      </w:pPr>
+      <w:r>
+        <w:rPr>
+          <w:rFonts w:ascii="맑은 고딕" w:hAnsi="맑은 고딕" w:eastAsia="맑은 고딕"/>
+          <w:b/>
+          <w:i w:val="0"/>
+          <w:color w:val="1F6D70"/>
+          <w:sz w:val="19"/>
+        </w:rPr>
+        <w:t>Model Answer  A: Not at all. Don't hesitate to ask if you need anything else.</w:t>
+      </w:r>
+    </w:p>
+    <w:p>
+      <w:pPr>
+        <w:keepNext/>
+        <w:spacing w:before="160" w:after="80" w:line="269" w:lineRule="auto"/>
+      </w:pPr>
+      <w:r>
+        <w:rPr>
+          <w:rFonts w:ascii="맑은 고딕" w:hAnsi="맑은 고딕" w:eastAsia="맑은 고딕"/>
+          <w:b w:val="0"/>
+          <w:i w:val="0"/>
+          <w:color w:val="F47B20"/>
+          <w:sz w:val="28"/>
+        </w:rPr>
+        <w:t>Self-Check</w:t>
+      </w:r>
+    </w:p>
+    <w:p>
+      <w:pPr>
+        <w:keepNext w:val="0"/>
+        <w:spacing w:before="0" w:after="80" w:line="269" w:lineRule="auto"/>
+      </w:pPr>
+      <w:r>
+        <w:rPr>
+          <w:rFonts w:ascii="맑은 고딕" w:hAnsi="맑은 고딕" w:eastAsia="맑은 고딕"/>
+          <w:b w:val="0"/>
+          <w:i w:val="0"/>
+          <w:sz w:val="20"/>
+        </w:rPr>
+        <w:t>☐  목표 패턴으로 문장을 시작했나요?</w:t>
+      </w:r>
+    </w:p>
+    <w:p>
+      <w:pPr>
+        <w:keepNext w:val="0"/>
+        <w:spacing w:before="0" w:after="80" w:line="269" w:lineRule="auto"/>
+      </w:pPr>
+      <w:r>
+        <w:rPr>
+          <w:rFonts w:ascii="맑은 고딕" w:hAnsi="맑은 고딕" w:eastAsia="맑은 고딕"/>
+          <w:b w:val="0"/>
+          <w:i w:val="0"/>
+          <w:sz w:val="20"/>
+        </w:rPr>
+        <w:t>☐  회의 상황에 맞는 어휘와 정중한 어조를 사용했나요?</w:t>
+      </w:r>
+    </w:p>
+    <w:p>
+      <w:pPr>
+        <w:keepNext w:val="0"/>
+        <w:spacing w:before="0" w:after="80" w:line="269" w:lineRule="auto"/>
+      </w:pPr>
+      <w:r>
+        <w:rPr>
+          <w:rFonts w:ascii="맑은 고딕" w:hAnsi="맑은 고딕" w:eastAsia="맑은 고딕"/>
+          <w:b w:val="0"/>
+          <w:i w:val="0"/>
+          <w:sz w:val="20"/>
+        </w:rPr>
+        <w:t>☐  문장을 보지 않고 한 번 더 말할 수 있나요?</w:t>
+      </w:r>
+    </w:p>
+    <w:p>
+      <w:r>
+        <w:br w:type="page"/>
+      </w:r>
+    </w:p>
+    <w:p>
+      <w:pPr>
+        <w:keepNext/>
+        <w:spacing w:before="0" w:after="40" w:line="269" w:lineRule="auto"/>
+      </w:pPr>
+      <w:r>
+        <w:rPr>
+          <w:rFonts w:ascii="맑은 고딕" w:hAnsi="맑은 고딕" w:eastAsia="맑은 고딕"/>
+          <w:b/>
+          <w:i w:val="0"/>
+          <w:color w:val="F47B20"/>
+          <w:sz w:val="36"/>
+        </w:rPr>
+        <w:t>Review 021~025 — Business Communication</w:t>
+      </w:r>
+    </w:p>
+    <w:p>
+      <w:pPr>
+        <w:keepNext w:val="0"/>
+        <w:spacing w:before="0" w:after="160" w:line="269" w:lineRule="auto"/>
+      </w:pPr>
+      <w:r>
+        <w:rPr>
+          <w:rFonts w:ascii="맑은 고딕" w:hAnsi="맑은 고딕" w:eastAsia="맑은 고딕"/>
+          <w:b w:val="0"/>
+          <w:i/>
+          <w:color w:val="595959"/>
+          <w:sz w:val="20"/>
+        </w:rPr>
+        <w:t>Pattern recall · Fill in the blanks · Guided role-play</w:t>
+      </w:r>
+    </w:p>
+    <w:p>
+      <w:pPr>
+        <w:keepNext w:val="0"/>
+        <w:spacing w:before="0" w:after="160" w:line="269" w:lineRule="auto"/>
+        <w:shd w:fill="FFF2E6"/>
+        <w:ind w:left="173" w:right="173"/>
+      </w:pPr>
+      <w:r>
+        <w:rPr>
+          <w:rFonts w:ascii="맑은 고딕" w:hAnsi="맑은 고딕" w:eastAsia="맑은 고딕"/>
+          <w:b w:val="0"/>
+          <w:i w:val="0"/>
+          <w:color w:val="595959"/>
+          <w:sz w:val="18"/>
+        </w:rPr>
+        <w:t>[ Teaching Guide ] 먼저 한국어 힌트만 보고 말하게 한 뒤, 모범답안과 비교합니다. 완전한 문장보다 목표 패턴을 정확히 시작하는지를 우선 확인하세요.</w:t>
+      </w:r>
+    </w:p>
+    <w:p>
+      <w:pPr>
+        <w:keepNext/>
+        <w:spacing w:before="160" w:after="80" w:line="269" w:lineRule="auto"/>
+      </w:pPr>
+      <w:r>
+        <w:rPr>
+          <w:rFonts w:ascii="맑은 고딕" w:hAnsi="맑은 고딕" w:eastAsia="맑은 고딕"/>
+          <w:b w:val="0"/>
+          <w:i w:val="0"/>
+          <w:color w:val="F47B20"/>
+          <w:sz w:val="28"/>
+        </w:rPr>
+        <w:t>Task 1. Pattern Recall — 한국어를 영어로 말해 보세요.</w:t>
+      </w:r>
+    </w:p>
+    <w:p>
+      <w:pPr>
+        <w:keepNext/>
+        <w:spacing w:before="60" w:after="40" w:line="269" w:lineRule="auto"/>
+        <w:ind w:left="72"/>
+      </w:pPr>
+      <w:r>
+        <w:rPr>
+          <w:rFonts w:ascii="맑은 고딕" w:hAnsi="맑은 고딕" w:eastAsia="맑은 고딕"/>
+          <w:b/>
+          <w:i w:val="0"/>
+          <w:sz w:val="20"/>
+        </w:rPr>
+        <w:t>021  계약서 사본을 주시겠어요?</w:t>
+      </w:r>
+    </w:p>
+    <w:p>
+      <w:pPr>
+        <w:keepNext w:val="0"/>
+        <w:spacing w:before="0" w:after="120" w:line="269" w:lineRule="auto"/>
+        <w:shd w:fill="EAF4F4"/>
+        <w:ind w:left="173" w:right="173"/>
+      </w:pPr>
+      <w:r>
+        <w:rPr>
+          <w:rFonts w:ascii="맑은 고딕" w:hAnsi="맑은 고딕" w:eastAsia="맑은 고딕"/>
+          <w:b/>
+          <w:i w:val="0"/>
+          <w:color w:val="1F6D70"/>
+          <w:sz w:val="19"/>
+        </w:rPr>
+        <w:t>Model Answer  Could you provide me with a copy of the contract?</w:t>
+      </w:r>
+    </w:p>
+    <w:p>
+      <w:pPr>
+        <w:keepNext/>
+        <w:spacing w:before="60" w:after="40" w:line="269" w:lineRule="auto"/>
+        <w:ind w:left="72"/>
+      </w:pPr>
+      <w:r>
+        <w:rPr>
+          <w:rFonts w:ascii="맑은 고딕" w:hAnsi="맑은 고딕" w:eastAsia="맑은 고딕"/>
+          <w:b/>
+          <w:i w:val="0"/>
+          <w:sz w:val="20"/>
+        </w:rPr>
+        <w:t>022  요약하자면, 프로젝트는 일정대로 진행되고 있습니다.</w:t>
+      </w:r>
+    </w:p>
+    <w:p>
+      <w:pPr>
+        <w:keepNext w:val="0"/>
+        <w:spacing w:before="0" w:after="120" w:line="269" w:lineRule="auto"/>
+        <w:shd w:fill="EAF4F4"/>
+        <w:ind w:left="173" w:right="173"/>
+      </w:pPr>
+      <w:r>
+        <w:rPr>
+          <w:rFonts w:ascii="맑은 고딕" w:hAnsi="맑은 고딕" w:eastAsia="맑은 고딕"/>
+          <w:b/>
+          <w:i w:val="0"/>
+          <w:color w:val="1F6D70"/>
+          <w:sz w:val="19"/>
+        </w:rPr>
+        <w:t>Model Answer  In summary, the project is on schedule.</w:t>
+      </w:r>
+    </w:p>
+    <w:p>
+      <w:pPr>
+        <w:keepNext/>
+        <w:spacing w:before="60" w:after="40" w:line="269" w:lineRule="auto"/>
+        <w:ind w:left="72"/>
+      </w:pPr>
+      <w:r>
+        <w:rPr>
+          <w:rFonts w:ascii="맑은 고딕" w:hAnsi="맑은 고딕" w:eastAsia="맑은 고딕"/>
+          <w:b/>
+          <w:i w:val="0"/>
+          <w:sz w:val="20"/>
+        </w:rPr>
+        <w:t>023  여러분의 노고에 감사드립니다.</w:t>
+      </w:r>
+    </w:p>
+    <w:p>
+      <w:pPr>
+        <w:keepNext w:val="0"/>
+        <w:spacing w:before="0" w:after="120" w:line="269" w:lineRule="auto"/>
+        <w:shd w:fill="EAF4F4"/>
+        <w:ind w:left="173" w:right="173"/>
+      </w:pPr>
+      <w:r>
+        <w:rPr>
+          <w:rFonts w:ascii="맑은 고딕" w:hAnsi="맑은 고딕" w:eastAsia="맑은 고딕"/>
+          <w:b/>
+          <w:i w:val="0"/>
+          <w:color w:val="1F6D70"/>
+          <w:sz w:val="19"/>
+        </w:rPr>
+        <w:t>Model Answer  I appreciate your hard work.</w:t>
+      </w:r>
+    </w:p>
+    <w:p>
+      <w:pPr>
+        <w:keepNext/>
+        <w:spacing w:before="60" w:after="40" w:line="269" w:lineRule="auto"/>
+        <w:ind w:left="72"/>
+      </w:pPr>
+      <w:r>
+        <w:rPr>
+          <w:rFonts w:ascii="맑은 고딕" w:hAnsi="맑은 고딕" w:eastAsia="맑은 고딕"/>
+          <w:b/>
+          <w:i w:val="0"/>
+          <w:sz w:val="20"/>
+        </w:rPr>
+        <w:t>024  모두 자유롭게 의견을 말하시길 권장합니다.</w:t>
+      </w:r>
+    </w:p>
+    <w:p>
+      <w:pPr>
+        <w:keepNext w:val="0"/>
+        <w:spacing w:before="0" w:after="120" w:line="269" w:lineRule="auto"/>
+        <w:shd w:fill="EAF4F4"/>
+        <w:ind w:left="173" w:right="173"/>
+      </w:pPr>
+      <w:r>
+        <w:rPr>
+          <w:rFonts w:ascii="맑은 고딕" w:hAnsi="맑은 고딕" w:eastAsia="맑은 고딕"/>
+          <w:b/>
+          <w:i w:val="0"/>
+          <w:color w:val="1F6D70"/>
+          <w:sz w:val="19"/>
+        </w:rPr>
+        <w:t>Model Answer  I encourage everyone to speak up.</w:t>
+      </w:r>
+    </w:p>
+    <w:p>
+      <w:pPr>
+        <w:keepNext/>
+        <w:spacing w:before="60" w:after="40" w:line="269" w:lineRule="auto"/>
+        <w:ind w:left="72"/>
+      </w:pPr>
+      <w:r>
+        <w:rPr>
+          <w:rFonts w:ascii="맑은 고딕" w:hAnsi="맑은 고딕" w:eastAsia="맑은 고딕"/>
+          <w:b/>
+          <w:i w:val="0"/>
+          <w:sz w:val="20"/>
+        </w:rPr>
+        <w:t>025  왜 일정이 바뀌었는지 아직도 이해가 안 돼요.</w:t>
+      </w:r>
+    </w:p>
+    <w:p>
+      <w:pPr>
+        <w:keepNext w:val="0"/>
+        <w:spacing w:before="0" w:after="120" w:line="269" w:lineRule="auto"/>
+        <w:shd w:fill="EAF4F4"/>
+        <w:ind w:left="173" w:right="173"/>
+      </w:pPr>
+      <w:r>
+        <w:rPr>
+          <w:rFonts w:ascii="맑은 고딕" w:hAnsi="맑은 고딕" w:eastAsia="맑은 고딕"/>
+          <w:b/>
+          <w:i w:val="0"/>
+          <w:color w:val="1F6D70"/>
+          <w:sz w:val="19"/>
+        </w:rPr>
+        <w:t>Model Answer  I still don't understand why the schedule changed.</w:t>
+      </w:r>
+    </w:p>
+    <w:p>
+      <w:r>
+        <w:br w:type="page"/>
+      </w:r>
+    </w:p>
+    <w:p>
+      <w:pPr>
+        <w:keepNext/>
+        <w:spacing w:before="0" w:after="140" w:line="269" w:lineRule="auto"/>
+      </w:pPr>
+      <w:r>
+        <w:rPr>
+          <w:rFonts w:ascii="맑은 고딕" w:hAnsi="맑은 고딕" w:eastAsia="맑은 고딕"/>
+          <w:b/>
+          <w:i w:val="0"/>
+          <w:color w:val="F47B20"/>
+          <w:sz w:val="32"/>
+        </w:rPr>
+        <w:t>Review 021~025 — Business Communication (continued)</w:t>
+      </w:r>
+    </w:p>
+    <w:p>
+      <w:pPr>
+        <w:keepNext/>
+        <w:spacing w:before="160" w:after="80" w:line="269" w:lineRule="auto"/>
+      </w:pPr>
+      <w:r>
+        <w:rPr>
+          <w:rFonts w:ascii="맑은 고딕" w:hAnsi="맑은 고딕" w:eastAsia="맑은 고딕"/>
+          <w:b w:val="0"/>
+          <w:i w:val="0"/>
+          <w:color w:val="F47B20"/>
+          <w:sz w:val="28"/>
+        </w:rPr>
+        <w:t>Task 2. Fill in the Blanks — 알맞은 패턴을 넣어 문장을 완성하세요.</w:t>
+      </w:r>
+    </w:p>
+    <w:p>
+      <w:pPr>
+        <w:keepNext/>
+        <w:spacing w:before="60" w:after="20" w:line="269" w:lineRule="auto"/>
+        <w:ind w:left="72"/>
+      </w:pPr>
+      <w:r>
+        <w:rPr>
+          <w:rFonts w:ascii="맑은 고딕" w:hAnsi="맑은 고딕" w:eastAsia="맑은 고딕"/>
+          <w:b/>
+          <w:i w:val="0"/>
+          <w:sz w:val="20"/>
+        </w:rPr>
+        <w:t>021  일정에 대한 자세한 정보를 주시겠어요?</w:t>
+      </w:r>
+    </w:p>
+    <w:p>
+      <w:pPr>
+        <w:keepNext w:val="0"/>
+        <w:spacing w:before="0" w:after="60" w:line="269" w:lineRule="auto"/>
+      </w:pPr>
+      <w:r>
+        <w:rPr>
+          <w:rFonts w:ascii="맑은 고딕" w:hAnsi="맑은 고딕" w:eastAsia="맑은 고딕"/>
+          <w:b w:val="0"/>
+          <w:i w:val="0"/>
+          <w:color w:val="595959"/>
+          <w:sz w:val="20"/>
+        </w:rPr>
+        <w:t>________________________ more details about the schedule?</w:t>
+      </w:r>
+    </w:p>
+    <w:p>
+      <w:pPr>
+        <w:keepNext w:val="0"/>
+        <w:spacing w:before="0" w:after="120" w:line="269" w:lineRule="auto"/>
+        <w:shd w:fill="EAF4F4"/>
+        <w:ind w:left="173" w:right="173"/>
+      </w:pPr>
+      <w:r>
+        <w:rPr>
+          <w:rFonts w:ascii="맑은 고딕" w:hAnsi="맑은 고딕" w:eastAsia="맑은 고딕"/>
+          <w:b/>
+          <w:i w:val="0"/>
+          <w:color w:val="1F6D70"/>
+          <w:sz w:val="19"/>
+        </w:rPr>
+        <w:t>Model Answer  Could you provide me with more details about the schedule?</w:t>
+      </w:r>
+    </w:p>
+    <w:p>
+      <w:pPr>
+        <w:keepNext/>
+        <w:spacing w:before="60" w:after="20" w:line="269" w:lineRule="auto"/>
+        <w:ind w:left="72"/>
+      </w:pPr>
+      <w:r>
+        <w:rPr>
+          <w:rFonts w:ascii="맑은 고딕" w:hAnsi="맑은 고딕" w:eastAsia="맑은 고딕"/>
+          <w:b/>
+          <w:i w:val="0"/>
+          <w:sz w:val="20"/>
+        </w:rPr>
+        <w:t>022  요약하자면, 결과는 예상보다 좋았습니다.</w:t>
+      </w:r>
+    </w:p>
+    <w:p>
+      <w:pPr>
+        <w:keepNext w:val="0"/>
+        <w:spacing w:before="0" w:after="60" w:line="269" w:lineRule="auto"/>
+      </w:pPr>
+      <w:r>
+        <w:rPr>
+          <w:rFonts w:ascii="맑은 고딕" w:hAnsi="맑은 고딕" w:eastAsia="맑은 고딕"/>
+          <w:b w:val="0"/>
+          <w:i w:val="0"/>
+          <w:color w:val="595959"/>
+          <w:sz w:val="20"/>
+        </w:rPr>
+        <w:t>________________________, the results were better than we expected.</w:t>
+      </w:r>
+    </w:p>
+    <w:p>
+      <w:pPr>
+        <w:keepNext w:val="0"/>
+        <w:spacing w:before="0" w:after="120" w:line="269" w:lineRule="auto"/>
+        <w:shd w:fill="EAF4F4"/>
+        <w:ind w:left="173" w:right="173"/>
+      </w:pPr>
+      <w:r>
+        <w:rPr>
+          <w:rFonts w:ascii="맑은 고딕" w:hAnsi="맑은 고딕" w:eastAsia="맑은 고딕"/>
+          <w:b/>
+          <w:i w:val="0"/>
+          <w:color w:val="1F6D70"/>
+          <w:sz w:val="19"/>
+        </w:rPr>
+        <w:t>Model Answer  In summary, the results were better than we expected.</w:t>
+      </w:r>
+    </w:p>
+    <w:p>
+      <w:pPr>
+        <w:keepNext/>
+        <w:spacing w:before="60" w:after="20" w:line="269" w:lineRule="auto"/>
+        <w:ind w:left="72"/>
+      </w:pPr>
+      <w:r>
+        <w:rPr>
+          <w:rFonts w:ascii="맑은 고딕" w:hAnsi="맑은 고딕" w:eastAsia="맑은 고딕"/>
+          <w:b/>
+          <w:i w:val="0"/>
+          <w:sz w:val="20"/>
+        </w:rPr>
+        <w:t>023  빠른 답장에 감사드립니다.</w:t>
+      </w:r>
+    </w:p>
+    <w:p>
+      <w:pPr>
+        <w:keepNext w:val="0"/>
+        <w:spacing w:before="0" w:after="60" w:line="269" w:lineRule="auto"/>
+      </w:pPr>
+      <w:r>
+        <w:rPr>
+          <w:rFonts w:ascii="맑은 고딕" w:hAnsi="맑은 고딕" w:eastAsia="맑은 고딕"/>
+          <w:b w:val="0"/>
+          <w:i w:val="0"/>
+          <w:color w:val="595959"/>
+          <w:sz w:val="20"/>
+        </w:rPr>
+        <w:t>________________________ your quick reply.</w:t>
+      </w:r>
+    </w:p>
+    <w:p>
+      <w:pPr>
+        <w:keepNext w:val="0"/>
+        <w:spacing w:before="0" w:after="120" w:line="269" w:lineRule="auto"/>
+        <w:shd w:fill="EAF4F4"/>
+        <w:ind w:left="173" w:right="173"/>
+      </w:pPr>
+      <w:r>
+        <w:rPr>
+          <w:rFonts w:ascii="맑은 고딕" w:hAnsi="맑은 고딕" w:eastAsia="맑은 고딕"/>
+          <w:b/>
+          <w:i w:val="0"/>
+          <w:color w:val="1F6D70"/>
+          <w:sz w:val="19"/>
+        </w:rPr>
+        <w:t>Model Answer  I appreciate your quick reply.</w:t>
+      </w:r>
+    </w:p>
+    <w:p>
+      <w:pPr>
+        <w:keepNext/>
+        <w:spacing w:before="60" w:after="20" w:line="269" w:lineRule="auto"/>
+        <w:ind w:left="72"/>
+      </w:pPr>
+      <w:r>
+        <w:rPr>
+          <w:rFonts w:ascii="맑은 고딕" w:hAnsi="맑은 고딕" w:eastAsia="맑은 고딕"/>
+          <w:b/>
+          <w:i w:val="0"/>
+          <w:sz w:val="20"/>
+        </w:rPr>
+        <w:t>024  새 도구를 일주일 동안 써 보시길 권해요.</w:t>
+      </w:r>
+    </w:p>
+    <w:p>
+      <w:pPr>
+        <w:keepNext w:val="0"/>
+        <w:spacing w:before="0" w:after="60" w:line="269" w:lineRule="auto"/>
+      </w:pPr>
+      <w:r>
+        <w:rPr>
+          <w:rFonts w:ascii="맑은 고딕" w:hAnsi="맑은 고딕" w:eastAsia="맑은 고딕"/>
+          <w:b w:val="0"/>
+          <w:i w:val="0"/>
+          <w:color w:val="595959"/>
+          <w:sz w:val="20"/>
+        </w:rPr>
+        <w:t>________________________ you to try the new tool for a week.</w:t>
+      </w:r>
+    </w:p>
+    <w:p>
+      <w:pPr>
+        <w:keepNext w:val="0"/>
+        <w:spacing w:before="0" w:after="120" w:line="269" w:lineRule="auto"/>
+        <w:shd w:fill="EAF4F4"/>
+        <w:ind w:left="173" w:right="173"/>
+      </w:pPr>
+      <w:r>
+        <w:rPr>
+          <w:rFonts w:ascii="맑은 고딕" w:hAnsi="맑은 고딕" w:eastAsia="맑은 고딕"/>
+          <w:b/>
+          <w:i w:val="0"/>
+          <w:color w:val="1F6D70"/>
+          <w:sz w:val="19"/>
+        </w:rPr>
+        <w:t>Model Answer  I encourage you to try the new tool for a week.</w:t>
+      </w:r>
+    </w:p>
+    <w:p>
+      <w:pPr>
+        <w:keepNext/>
+        <w:spacing w:before="60" w:after="20" w:line="269" w:lineRule="auto"/>
+        <w:ind w:left="72"/>
+      </w:pPr>
+      <w:r>
+        <w:rPr>
+          <w:rFonts w:ascii="맑은 고딕" w:hAnsi="맑은 고딕" w:eastAsia="맑은 고딕"/>
+          <w:b/>
+          <w:i w:val="0"/>
+          <w:sz w:val="20"/>
+        </w:rPr>
+        <w:t>025  이 두 옵션의 차이를 아직도 모르겠어요.</w:t>
+      </w:r>
+    </w:p>
+    <w:p>
+      <w:pPr>
+        <w:keepNext w:val="0"/>
+        <w:spacing w:before="0" w:after="60" w:line="269" w:lineRule="auto"/>
+      </w:pPr>
+      <w:r>
+        <w:rPr>
+          <w:rFonts w:ascii="맑은 고딕" w:hAnsi="맑은 고딕" w:eastAsia="맑은 고딕"/>
+          <w:b w:val="0"/>
+          <w:i w:val="0"/>
+          <w:color w:val="595959"/>
+          <w:sz w:val="20"/>
+        </w:rPr>
+        <w:t>________________________ the difference between these two options.</w:t>
+      </w:r>
+    </w:p>
+    <w:p>
+      <w:pPr>
+        <w:keepNext w:val="0"/>
+        <w:spacing w:before="0" w:after="120" w:line="269" w:lineRule="auto"/>
+        <w:shd w:fill="EAF4F4"/>
+        <w:ind w:left="173" w:right="173"/>
+      </w:pPr>
+      <w:r>
+        <w:rPr>
+          <w:rFonts w:ascii="맑은 고딕" w:hAnsi="맑은 고딕" w:eastAsia="맑은 고딕"/>
+          <w:b/>
+          <w:i w:val="0"/>
+          <w:color w:val="1F6D70"/>
+          <w:sz w:val="19"/>
+        </w:rPr>
+        <w:t>Model Answer  I still don't understand the difference between these two options.</w:t>
+      </w:r>
+    </w:p>
+    <w:p>
+      <w:r>
+        <w:br w:type="page"/>
+      </w:r>
+    </w:p>
+    <w:p>
+      <w:pPr>
+        <w:keepNext/>
+        <w:spacing w:before="0" w:after="140" w:line="269" w:lineRule="auto"/>
+      </w:pPr>
+      <w:r>
+        <w:rPr>
+          <w:rFonts w:ascii="맑은 고딕" w:hAnsi="맑은 고딕" w:eastAsia="맑은 고딕"/>
+          <w:b/>
+          <w:i w:val="0"/>
+          <w:color w:val="F47B20"/>
+          <w:sz w:val="32"/>
+        </w:rPr>
+        <w:t>Review 021~025 — Business Communication — Speaking Activity</w:t>
+      </w:r>
+    </w:p>
+    <w:p>
+      <w:pPr>
+        <w:keepNext/>
+        <w:spacing w:before="160" w:after="80" w:line="269" w:lineRule="auto"/>
+      </w:pPr>
+      <w:r>
+        <w:rPr>
+          <w:rFonts w:ascii="맑은 고딕" w:hAnsi="맑은 고딕" w:eastAsia="맑은 고딕"/>
+          <w:b w:val="0"/>
+          <w:i w:val="0"/>
+          <w:color w:val="F47B20"/>
+          <w:sz w:val="28"/>
+        </w:rPr>
+        <w:t>Task 3. Guided Role-Play — 상황에 맞게 대화를 완성하세요.</w:t>
+      </w:r>
+    </w:p>
+    <w:p>
+      <w:pPr>
+        <w:keepNext/>
+        <w:spacing w:before="100" w:after="80" w:line="269" w:lineRule="auto"/>
+        <w:shd w:fill="F7F7F7"/>
+        <w:ind w:left="144" w:right="144"/>
+      </w:pPr>
+      <w:r>
+        <w:rPr>
+          <w:rFonts w:ascii="맑은 고딕" w:hAnsi="맑은 고딕" w:eastAsia="맑은 고딕"/>
+          <w:b/>
+          <w:i w:val="0"/>
+          <w:sz w:val="20"/>
+        </w:rPr>
+        <w:t>Situation 1  프로젝트 현황을 요청하고 핵심 내용을 요약한 뒤 팀의 노고에 감사를 표현하세요.</w:t>
+      </w:r>
+    </w:p>
+    <w:p>
+      <w:pPr>
+        <w:keepNext w:val="0"/>
+        <w:spacing w:before="0" w:after="120" w:line="269" w:lineRule="auto"/>
+        <w:shd w:fill="EAF4F4"/>
+        <w:ind w:left="173" w:right="173"/>
+      </w:pPr>
+      <w:r>
+        <w:rPr>
+          <w:rFonts w:ascii="맑은 고딕" w:hAnsi="맑은 고딕" w:eastAsia="맑은 고딕"/>
+          <w:b/>
+          <w:i w:val="0"/>
+          <w:color w:val="1F6D70"/>
+          <w:sz w:val="19"/>
+        </w:rPr>
+        <w:t>Model Answer  A: Could you provide me with an update on the testing phase?</w:t>
+      </w:r>
+    </w:p>
+    <w:p>
+      <w:pPr>
+        <w:keepNext w:val="0"/>
+        <w:spacing w:before="0" w:after="120" w:line="269" w:lineRule="auto"/>
+        <w:shd w:fill="EAF4F4"/>
+        <w:ind w:left="173" w:right="173"/>
+      </w:pPr>
+      <w:r>
+        <w:rPr>
+          <w:rFonts w:ascii="맑은 고딕" w:hAnsi="맑은 고딕" w:eastAsia="맑은 고딕"/>
+          <w:b/>
+          <w:i w:val="0"/>
+          <w:color w:val="1F6D70"/>
+          <w:sz w:val="19"/>
+        </w:rPr>
+        <w:t>Model Answer  B: We completed most of the tests this week.</w:t>
+      </w:r>
+    </w:p>
+    <w:p>
+      <w:pPr>
+        <w:keepNext w:val="0"/>
+        <w:spacing w:before="0" w:after="120" w:line="269" w:lineRule="auto"/>
+        <w:shd w:fill="EAF4F4"/>
+        <w:ind w:left="173" w:right="173"/>
+      </w:pPr>
+      <w:r>
+        <w:rPr>
+          <w:rFonts w:ascii="맑은 고딕" w:hAnsi="맑은 고딕" w:eastAsia="맑은 고딕"/>
+          <w:b/>
+          <w:i w:val="0"/>
+          <w:color w:val="1F6D70"/>
+          <w:sz w:val="19"/>
+        </w:rPr>
+        <w:t>Model Answer  A: In summary, the project is on schedule. I appreciate everyone's hard work.</w:t>
+      </w:r>
+    </w:p>
+    <w:p>
+      <w:pPr>
+        <w:keepNext/>
+        <w:spacing w:before="100" w:after="80" w:line="269" w:lineRule="auto"/>
+        <w:shd w:fill="F7F7F7"/>
+        <w:ind w:left="144" w:right="144"/>
+      </w:pPr>
+      <w:r>
+        <w:rPr>
+          <w:rFonts w:ascii="맑은 고딕" w:hAnsi="맑은 고딕" w:eastAsia="맑은 고딕"/>
+          <w:b/>
+          <w:i w:val="0"/>
+          <w:sz w:val="20"/>
+        </w:rPr>
+        <w:t>Situation 2  설명이 이해되지 않은 상황에서 재설명을 요청하고 팀원에게 의견을 권하세요.</w:t>
+      </w:r>
+    </w:p>
+    <w:p>
+      <w:pPr>
+        <w:keepNext w:val="0"/>
+        <w:spacing w:before="0" w:after="120" w:line="269" w:lineRule="auto"/>
+        <w:shd w:fill="EAF4F4"/>
+        <w:ind w:left="173" w:right="173"/>
+      </w:pPr>
+      <w:r>
+        <w:rPr>
+          <w:rFonts w:ascii="맑은 고딕" w:hAnsi="맑은 고딕" w:eastAsia="맑은 고딕"/>
+          <w:b/>
+          <w:i w:val="0"/>
+          <w:color w:val="1F6D70"/>
+          <w:sz w:val="19"/>
+        </w:rPr>
+        <w:t>Model Answer  A: I still don't understand the purpose of this change. Could you explain it again?</w:t>
+      </w:r>
+    </w:p>
+    <w:p>
+      <w:pPr>
+        <w:keepNext w:val="0"/>
+        <w:spacing w:before="0" w:after="120" w:line="269" w:lineRule="auto"/>
+        <w:shd w:fill="EAF4F4"/>
+        <w:ind w:left="173" w:right="173"/>
+      </w:pPr>
+      <w:r>
+        <w:rPr>
+          <w:rFonts w:ascii="맑은 고딕" w:hAnsi="맑은 고딕" w:eastAsia="맑은 고딕"/>
+          <w:b/>
+          <w:i w:val="0"/>
+          <w:color w:val="1F6D70"/>
+          <w:sz w:val="19"/>
+        </w:rPr>
+        <w:t>Model Answer  B: Certainly. The change will make the service easier to use.</w:t>
+      </w:r>
+    </w:p>
+    <w:p>
+      <w:pPr>
+        <w:keepNext w:val="0"/>
+        <w:spacing w:before="0" w:after="120" w:line="269" w:lineRule="auto"/>
+        <w:shd w:fill="EAF4F4"/>
+        <w:ind w:left="173" w:right="173"/>
+      </w:pPr>
+      <w:r>
+        <w:rPr>
+          <w:rFonts w:ascii="맑은 고딕" w:hAnsi="맑은 고딕" w:eastAsia="맑은 고딕"/>
+          <w:b/>
+          <w:i w:val="0"/>
+          <w:color w:val="1F6D70"/>
+          <w:sz w:val="19"/>
+        </w:rPr>
+        <w:t>Model Answer  A: Thank you. I encourage everyone to share any concerns.</w:t>
+      </w:r>
+    </w:p>
+    <w:p>
+      <w:pPr>
+        <w:keepNext/>
+        <w:spacing w:before="160" w:after="80" w:line="269" w:lineRule="auto"/>
+      </w:pPr>
+      <w:r>
+        <w:rPr>
+          <w:rFonts w:ascii="맑은 고딕" w:hAnsi="맑은 고딕" w:eastAsia="맑은 고딕"/>
+          <w:b w:val="0"/>
+          <w:i w:val="0"/>
+          <w:color w:val="F47B20"/>
+          <w:sz w:val="28"/>
+        </w:rPr>
+        <w:t>Self-Check</w:t>
+      </w:r>
+    </w:p>
+    <w:p>
+      <w:pPr>
+        <w:keepNext w:val="0"/>
+        <w:spacing w:before="0" w:after="80" w:line="269" w:lineRule="auto"/>
+      </w:pPr>
+      <w:r>
+        <w:rPr>
+          <w:rFonts w:ascii="맑은 고딕" w:hAnsi="맑은 고딕" w:eastAsia="맑은 고딕"/>
+          <w:b w:val="0"/>
+          <w:i w:val="0"/>
+          <w:sz w:val="20"/>
+        </w:rPr>
+        <w:t>☐  목표 패턴으로 문장을 시작했나요?</w:t>
+      </w:r>
+    </w:p>
+    <w:p>
+      <w:pPr>
+        <w:keepNext w:val="0"/>
+        <w:spacing w:before="0" w:after="80" w:line="269" w:lineRule="auto"/>
+      </w:pPr>
+      <w:r>
+        <w:rPr>
+          <w:rFonts w:ascii="맑은 고딕" w:hAnsi="맑은 고딕" w:eastAsia="맑은 고딕"/>
+          <w:b w:val="0"/>
+          <w:i w:val="0"/>
+          <w:sz w:val="20"/>
+        </w:rPr>
+        <w:t>☐  회의 상황에 맞는 어휘와 정중한 어조를 사용했나요?</w:t>
+      </w:r>
+    </w:p>
+    <w:p>
+      <w:pPr>
+        <w:keepNext w:val="0"/>
+        <w:spacing w:before="0" w:after="80" w:line="269" w:lineRule="auto"/>
+      </w:pPr>
+      <w:r>
+        <w:rPr>
+          <w:rFonts w:ascii="맑은 고딕" w:hAnsi="맑은 고딕" w:eastAsia="맑은 고딕"/>
+          <w:b w:val="0"/>
+          <w:i w:val="0"/>
+          <w:sz w:val="20"/>
+        </w:rPr>
+        <w:t>☐  문장을 보지 않고 한 번 더 말할 수 있나요?</w:t>
+      </w:r>
+    </w:p>
+    <w:p>
+      <w:r>
+        <w:br w:type="page"/>
+      </w:r>
+    </w:p>
+    <w:p>
+      <w:pPr>
+        <w:keepNext/>
+        <w:spacing w:before="0" w:after="40" w:line="269" w:lineRule="auto"/>
+      </w:pPr>
+      <w:r>
+        <w:rPr>
+          <w:rFonts w:ascii="맑은 고딕" w:hAnsi="맑은 고딕" w:eastAsia="맑은 고딕"/>
+          <w:b/>
+          <w:i w:val="0"/>
+          <w:color w:val="F47B20"/>
+          <w:sz w:val="36"/>
+        </w:rPr>
+        <w:t>Review 026~031 — Troubleshooting and Advanced Responses</w:t>
+      </w:r>
+    </w:p>
+    <w:p>
+      <w:pPr>
+        <w:keepNext w:val="0"/>
+        <w:spacing w:before="0" w:after="160" w:line="269" w:lineRule="auto"/>
+      </w:pPr>
+      <w:r>
+        <w:rPr>
+          <w:rFonts w:ascii="맑은 고딕" w:hAnsi="맑은 고딕" w:eastAsia="맑은 고딕"/>
+          <w:b w:val="0"/>
+          <w:i/>
+          <w:color w:val="595959"/>
+          <w:sz w:val="20"/>
+        </w:rPr>
+        <w:t>Pattern recall · Fill in the blanks · Guided role-play</w:t>
+      </w:r>
+    </w:p>
+    <w:p>
+      <w:pPr>
+        <w:keepNext w:val="0"/>
+        <w:spacing w:before="0" w:after="160" w:line="269" w:lineRule="auto"/>
+        <w:shd w:fill="FFF2E6"/>
+        <w:ind w:left="173" w:right="173"/>
+      </w:pPr>
+      <w:r>
+        <w:rPr>
+          <w:rFonts w:ascii="맑은 고딕" w:hAnsi="맑은 고딕" w:eastAsia="맑은 고딕"/>
+          <w:b w:val="0"/>
+          <w:i w:val="0"/>
+          <w:color w:val="595959"/>
+          <w:sz w:val="18"/>
+        </w:rPr>
+        <w:t>[ Teaching Guide ] 먼저 한국어 힌트만 보고 말하게 한 뒤, 모범답안과 비교합니다. 완전한 문장보다 목표 패턴을 정확히 시작하는지를 우선 확인하세요.</w:t>
+      </w:r>
+    </w:p>
+    <w:p>
+      <w:pPr>
+        <w:keepNext/>
+        <w:spacing w:before="160" w:after="80" w:line="269" w:lineRule="auto"/>
+      </w:pPr>
+      <w:r>
+        <w:rPr>
+          <w:rFonts w:ascii="맑은 고딕" w:hAnsi="맑은 고딕" w:eastAsia="맑은 고딕"/>
+          <w:b w:val="0"/>
+          <w:i w:val="0"/>
+          <w:color w:val="F47B20"/>
+          <w:sz w:val="28"/>
+        </w:rPr>
+        <w:t>Task 1. Pattern Recall — 한국어를 영어로 말해 보세요.</w:t>
+      </w:r>
+    </w:p>
+    <w:p>
+      <w:pPr>
+        <w:keepNext/>
+        <w:spacing w:before="60" w:after="40" w:line="269" w:lineRule="auto"/>
+        <w:ind w:left="72"/>
+      </w:pPr>
+      <w:r>
+        <w:rPr>
+          <w:rFonts w:ascii="맑은 고딕" w:hAnsi="맑은 고딕" w:eastAsia="맑은 고딕"/>
+          <w:b/>
+          <w:i w:val="0"/>
+          <w:sz w:val="20"/>
+        </w:rPr>
+        <w:t>026  화면 공유가 잘 안 되고 있어요.</w:t>
+      </w:r>
+    </w:p>
+    <w:p>
+      <w:pPr>
+        <w:keepNext w:val="0"/>
+        <w:spacing w:before="0" w:after="120" w:line="269" w:lineRule="auto"/>
+        <w:shd w:fill="EAF4F4"/>
+        <w:ind w:left="173" w:right="173"/>
+      </w:pPr>
+      <w:r>
+        <w:rPr>
+          <w:rFonts w:ascii="맑은 고딕" w:hAnsi="맑은 고딕" w:eastAsia="맑은 고딕"/>
+          <w:b/>
+          <w:i w:val="0"/>
+          <w:color w:val="1F6D70"/>
+          <w:sz w:val="19"/>
+        </w:rPr>
+        <w:t>Model Answer  I'm having trouble sharing my screen.</w:t>
+      </w:r>
+    </w:p>
+    <w:p>
+      <w:pPr>
+        <w:keepNext/>
+        <w:spacing w:before="60" w:after="40" w:line="269" w:lineRule="auto"/>
+        <w:ind w:left="72"/>
+      </w:pPr>
+      <w:r>
+        <w:rPr>
+          <w:rFonts w:ascii="맑은 고딕" w:hAnsi="맑은 고딕" w:eastAsia="맑은 고딕"/>
+          <w:b/>
+          <w:i w:val="0"/>
+          <w:sz w:val="20"/>
+        </w:rPr>
+        <w:t>027  왜 제 카메라가 작동하지 않는지 누가 좀 봐 주실래요?</w:t>
+      </w:r>
+    </w:p>
+    <w:p>
+      <w:pPr>
+        <w:keepNext w:val="0"/>
+        <w:spacing w:before="0" w:after="120" w:line="269" w:lineRule="auto"/>
+        <w:shd w:fill="EAF4F4"/>
+        <w:ind w:left="173" w:right="173"/>
+      </w:pPr>
+      <w:r>
+        <w:rPr>
+          <w:rFonts w:ascii="맑은 고딕" w:hAnsi="맑은 고딕" w:eastAsia="맑은 고딕"/>
+          <w:b/>
+          <w:i w:val="0"/>
+          <w:color w:val="1F6D70"/>
+          <w:sz w:val="19"/>
+        </w:rPr>
+        <w:t>Model Answer  Can someone help me troubleshoot why my camera isn't working?</w:t>
+      </w:r>
+    </w:p>
+    <w:p>
+      <w:pPr>
+        <w:keepNext/>
+        <w:spacing w:before="60" w:after="40" w:line="269" w:lineRule="auto"/>
+        <w:ind w:left="72"/>
+      </w:pPr>
+      <w:r>
+        <w:rPr>
+          <w:rFonts w:ascii="맑은 고딕" w:hAnsi="맑은 고딕" w:eastAsia="맑은 고딕"/>
+          <w:b/>
+          <w:i w:val="0"/>
+          <w:sz w:val="20"/>
+        </w:rPr>
+        <w:t>028  이유가 무엇이든, 금요일 전에 해결해야 합니다.</w:t>
+      </w:r>
+    </w:p>
+    <w:p>
+      <w:pPr>
+        <w:keepNext w:val="0"/>
+        <w:spacing w:before="0" w:after="120" w:line="269" w:lineRule="auto"/>
+        <w:shd w:fill="EAF4F4"/>
+        <w:ind w:left="173" w:right="173"/>
+      </w:pPr>
+      <w:r>
+        <w:rPr>
+          <w:rFonts w:ascii="맑은 고딕" w:hAnsi="맑은 고딕" w:eastAsia="맑은 고딕"/>
+          <w:b/>
+          <w:i w:val="0"/>
+          <w:color w:val="1F6D70"/>
+          <w:sz w:val="19"/>
+        </w:rPr>
+        <w:t>Model Answer  Whatever the reason, we need to fix it before Friday.</w:t>
+      </w:r>
+    </w:p>
+    <w:p>
+      <w:pPr>
+        <w:keepNext/>
+        <w:spacing w:before="60" w:after="40" w:line="269" w:lineRule="auto"/>
+        <w:ind w:left="72"/>
+      </w:pPr>
+      <w:r>
+        <w:rPr>
+          <w:rFonts w:ascii="맑은 고딕" w:hAnsi="맑은 고딕" w:eastAsia="맑은 고딕"/>
+          <w:b/>
+          <w:i w:val="0"/>
+          <w:sz w:val="20"/>
+        </w:rPr>
+        <w:t>029  새 정책의 일환으로 모든 회의는 50분 안에 끝납니다.</w:t>
+      </w:r>
+    </w:p>
+    <w:p>
+      <w:pPr>
+        <w:keepNext w:val="0"/>
+        <w:spacing w:before="0" w:after="120" w:line="269" w:lineRule="auto"/>
+        <w:shd w:fill="EAF4F4"/>
+        <w:ind w:left="173" w:right="173"/>
+      </w:pPr>
+      <w:r>
+        <w:rPr>
+          <w:rFonts w:ascii="맑은 고딕" w:hAnsi="맑은 고딕" w:eastAsia="맑은 고딕"/>
+          <w:b/>
+          <w:i w:val="0"/>
+          <w:color w:val="1F6D70"/>
+          <w:sz w:val="19"/>
+        </w:rPr>
+        <w:t>Model Answer  As part of the new policy, all meetings will end in fifty minutes.</w:t>
+      </w:r>
+    </w:p>
+    <w:p>
+      <w:pPr>
+        <w:keepNext/>
+        <w:spacing w:before="60" w:after="40" w:line="269" w:lineRule="auto"/>
+        <w:ind w:left="72"/>
+      </w:pPr>
+      <w:r>
+        <w:rPr>
+          <w:rFonts w:ascii="맑은 고딕" w:hAnsi="맑은 고딕" w:eastAsia="맑은 고딕"/>
+          <w:b/>
+          <w:i w:val="0"/>
+          <w:sz w:val="20"/>
+        </w:rPr>
+        <w:t>030  질문이 있을 때마다 손을 들어 주세요.</w:t>
+      </w:r>
+    </w:p>
+    <w:p>
+      <w:pPr>
+        <w:keepNext w:val="0"/>
+        <w:spacing w:before="0" w:after="120" w:line="269" w:lineRule="auto"/>
+        <w:shd w:fill="EAF4F4"/>
+        <w:ind w:left="173" w:right="173"/>
+      </w:pPr>
+      <w:r>
+        <w:rPr>
+          <w:rFonts w:ascii="맑은 고딕" w:hAnsi="맑은 고딕" w:eastAsia="맑은 고딕"/>
+          <w:b/>
+          <w:i w:val="0"/>
+          <w:color w:val="1F6D70"/>
+          <w:sz w:val="19"/>
+        </w:rPr>
+        <w:t>Model Answer  Whenever you have a question, please raise your hand.</w:t>
+      </w:r>
+    </w:p>
+    <w:p>
+      <w:pPr>
+        <w:keepNext/>
+        <w:spacing w:before="60" w:after="40" w:line="269" w:lineRule="auto"/>
+        <w:ind w:left="72"/>
+      </w:pPr>
+      <w:r>
+        <w:rPr>
+          <w:rFonts w:ascii="맑은 고딕" w:hAnsi="맑은 고딕" w:eastAsia="맑은 고딕"/>
+          <w:b/>
+          <w:i w:val="0"/>
+          <w:sz w:val="20"/>
+        </w:rPr>
+        <w:t>031  직원들은 이번 주에 안전 교육을 받고 있습니다.</w:t>
+      </w:r>
+    </w:p>
+    <w:p>
+      <w:pPr>
+        <w:keepNext w:val="0"/>
+        <w:spacing w:before="0" w:after="120" w:line="269" w:lineRule="auto"/>
+        <w:shd w:fill="EAF4F4"/>
+        <w:ind w:left="173" w:right="173"/>
+      </w:pPr>
+      <w:r>
+        <w:rPr>
+          <w:rFonts w:ascii="맑은 고딕" w:hAnsi="맑은 고딕" w:eastAsia="맑은 고딕"/>
+          <w:b/>
+          <w:i w:val="0"/>
+          <w:color w:val="1F6D70"/>
+          <w:sz w:val="19"/>
+        </w:rPr>
+        <w:t>Model Answer  The staff is undergoing safety training this week.</w:t>
+      </w:r>
+    </w:p>
+    <w:p>
+      <w:r>
+        <w:br w:type="page"/>
+      </w:r>
+    </w:p>
+    <w:p>
+      <w:pPr>
+        <w:keepNext/>
+        <w:spacing w:before="0" w:after="140" w:line="269" w:lineRule="auto"/>
+      </w:pPr>
+      <w:r>
+        <w:rPr>
+          <w:rFonts w:ascii="맑은 고딕" w:hAnsi="맑은 고딕" w:eastAsia="맑은 고딕"/>
+          <w:b/>
+          <w:i w:val="0"/>
+          <w:color w:val="F47B20"/>
+          <w:sz w:val="32"/>
+        </w:rPr>
+        <w:t>Review 026~031 — Troubleshooting and Advanced Responses (continued)</w:t>
+      </w:r>
+    </w:p>
+    <w:p>
+      <w:pPr>
+        <w:keepNext/>
+        <w:spacing w:before="160" w:after="80" w:line="269" w:lineRule="auto"/>
+      </w:pPr>
+      <w:r>
+        <w:rPr>
+          <w:rFonts w:ascii="맑은 고딕" w:hAnsi="맑은 고딕" w:eastAsia="맑은 고딕"/>
+          <w:b w:val="0"/>
+          <w:i w:val="0"/>
+          <w:color w:val="F47B20"/>
+          <w:sz w:val="28"/>
+        </w:rPr>
+        <w:t>Task 2. Fill in the Blanks — 알맞은 패턴을 넣어 문장을 완성하세요.</w:t>
+      </w:r>
+    </w:p>
+    <w:p>
+      <w:pPr>
+        <w:keepNext/>
+        <w:spacing w:before="60" w:after="20" w:line="269" w:lineRule="auto"/>
+        <w:ind w:left="72"/>
+      </w:pPr>
+      <w:r>
+        <w:rPr>
+          <w:rFonts w:ascii="맑은 고딕" w:hAnsi="맑은 고딕" w:eastAsia="맑은 고딕"/>
+          <w:b/>
+          <w:i w:val="0"/>
+          <w:sz w:val="20"/>
+        </w:rPr>
+        <w:t>026  보내주신 파일이 안 열려요.</w:t>
+      </w:r>
+    </w:p>
+    <w:p>
+      <w:pPr>
+        <w:keepNext w:val="0"/>
+        <w:spacing w:before="0" w:after="60" w:line="269" w:lineRule="auto"/>
+      </w:pPr>
+      <w:r>
+        <w:rPr>
+          <w:rFonts w:ascii="맑은 고딕" w:hAnsi="맑은 고딕" w:eastAsia="맑은 고딕"/>
+          <w:b w:val="0"/>
+          <w:i w:val="0"/>
+          <w:color w:val="595959"/>
+          <w:sz w:val="20"/>
+        </w:rPr>
+        <w:t>________________________ opening the file you sent.</w:t>
+      </w:r>
+    </w:p>
+    <w:p>
+      <w:pPr>
+        <w:keepNext w:val="0"/>
+        <w:spacing w:before="0" w:after="120" w:line="269" w:lineRule="auto"/>
+        <w:shd w:fill="EAF4F4"/>
+        <w:ind w:left="173" w:right="173"/>
+      </w:pPr>
+      <w:r>
+        <w:rPr>
+          <w:rFonts w:ascii="맑은 고딕" w:hAnsi="맑은 고딕" w:eastAsia="맑은 고딕"/>
+          <w:b/>
+          <w:i w:val="0"/>
+          <w:color w:val="1F6D70"/>
+          <w:sz w:val="19"/>
+        </w:rPr>
+        <w:t>Model Answer  I'm having trouble opening the file you sent.</w:t>
+      </w:r>
+    </w:p>
+    <w:p>
+      <w:pPr>
+        <w:keepNext/>
+        <w:spacing w:before="60" w:after="20" w:line="269" w:lineRule="auto"/>
+        <w:ind w:left="72"/>
+      </w:pPr>
+      <w:r>
+        <w:rPr>
+          <w:rFonts w:ascii="맑은 고딕" w:hAnsi="맑은 고딕" w:eastAsia="맑은 고딕"/>
+          <w:b/>
+          <w:i w:val="0"/>
+          <w:sz w:val="20"/>
+        </w:rPr>
+        <w:t>027  이 오류 메시지 해결을 도와주실 분 있나요?</w:t>
+      </w:r>
+    </w:p>
+    <w:p>
+      <w:pPr>
+        <w:keepNext w:val="0"/>
+        <w:spacing w:before="0" w:after="60" w:line="269" w:lineRule="auto"/>
+      </w:pPr>
+      <w:r>
+        <w:rPr>
+          <w:rFonts w:ascii="맑은 고딕" w:hAnsi="맑은 고딕" w:eastAsia="맑은 고딕"/>
+          <w:b w:val="0"/>
+          <w:i w:val="0"/>
+          <w:color w:val="595959"/>
+          <w:sz w:val="20"/>
+        </w:rPr>
+        <w:t>________________________ this error message?</w:t>
+      </w:r>
+    </w:p>
+    <w:p>
+      <w:pPr>
+        <w:keepNext w:val="0"/>
+        <w:spacing w:before="0" w:after="120" w:line="269" w:lineRule="auto"/>
+        <w:shd w:fill="EAF4F4"/>
+        <w:ind w:left="173" w:right="173"/>
+      </w:pPr>
+      <w:r>
+        <w:rPr>
+          <w:rFonts w:ascii="맑은 고딕" w:hAnsi="맑은 고딕" w:eastAsia="맑은 고딕"/>
+          <w:b/>
+          <w:i w:val="0"/>
+          <w:color w:val="1F6D70"/>
+          <w:sz w:val="19"/>
+        </w:rPr>
+        <w:t>Model Answer  Can someone help me troubleshoot this error message?</w:t>
+      </w:r>
+    </w:p>
+    <w:p>
+      <w:pPr>
+        <w:keepNext/>
+        <w:spacing w:before="60" w:after="20" w:line="269" w:lineRule="auto"/>
+        <w:ind w:left="72"/>
+      </w:pPr>
+      <w:r>
+        <w:rPr>
+          <w:rFonts w:ascii="맑은 고딕" w:hAnsi="맑은 고딕" w:eastAsia="맑은 고딕"/>
+          <w:b/>
+          <w:i w:val="0"/>
+          <w:sz w:val="20"/>
+        </w:rPr>
+        <w:t>028  무슨 일이 있어도 계획대로 진행합시다.</w:t>
+      </w:r>
+    </w:p>
+    <w:p>
+      <w:pPr>
+        <w:keepNext w:val="0"/>
+        <w:spacing w:before="0" w:after="60" w:line="269" w:lineRule="auto"/>
+      </w:pPr>
+      <w:r>
+        <w:rPr>
+          <w:rFonts w:ascii="맑은 고딕" w:hAnsi="맑은 고딕" w:eastAsia="맑은 고딕"/>
+          <w:b w:val="0"/>
+          <w:i w:val="0"/>
+          <w:color w:val="595959"/>
+          <w:sz w:val="20"/>
+        </w:rPr>
+        <w:t>________________________ happens, let's follow the plan.</w:t>
+      </w:r>
+    </w:p>
+    <w:p>
+      <w:pPr>
+        <w:keepNext w:val="0"/>
+        <w:spacing w:before="0" w:after="120" w:line="269" w:lineRule="auto"/>
+        <w:shd w:fill="EAF4F4"/>
+        <w:ind w:left="173" w:right="173"/>
+      </w:pPr>
+      <w:r>
+        <w:rPr>
+          <w:rFonts w:ascii="맑은 고딕" w:hAnsi="맑은 고딕" w:eastAsia="맑은 고딕"/>
+          <w:b/>
+          <w:i w:val="0"/>
+          <w:color w:val="1F6D70"/>
+          <w:sz w:val="19"/>
+        </w:rPr>
+        <w:t>Model Answer  Whatever happens, let's follow the plan.</w:t>
+      </w:r>
+    </w:p>
+    <w:p>
+      <w:pPr>
+        <w:keepNext/>
+        <w:spacing w:before="60" w:after="20" w:line="269" w:lineRule="auto"/>
+        <w:ind w:left="72"/>
+      </w:pPr>
+      <w:r>
+        <w:rPr>
+          <w:rFonts w:ascii="맑은 고딕" w:hAnsi="맑은 고딕" w:eastAsia="맑은 고딕"/>
+          <w:b/>
+          <w:i w:val="0"/>
+          <w:sz w:val="20"/>
+        </w:rPr>
+        <w:t>029  교육 과정의 일환으로 선배 직원의 업무를 참관하게 됩니다.</w:t>
+      </w:r>
+    </w:p>
+    <w:p>
+      <w:pPr>
+        <w:keepNext w:val="0"/>
+        <w:spacing w:before="0" w:after="60" w:line="269" w:lineRule="auto"/>
+      </w:pPr>
+      <w:r>
+        <w:rPr>
+          <w:rFonts w:ascii="맑은 고딕" w:hAnsi="맑은 고딕" w:eastAsia="맑은 고딕"/>
+          <w:b w:val="0"/>
+          <w:i w:val="0"/>
+          <w:color w:val="595959"/>
+          <w:sz w:val="20"/>
+        </w:rPr>
+        <w:t>________________________ the training, you will shadow a senior employee.</w:t>
+      </w:r>
+    </w:p>
+    <w:p>
+      <w:pPr>
+        <w:keepNext w:val="0"/>
+        <w:spacing w:before="0" w:after="120" w:line="269" w:lineRule="auto"/>
+        <w:shd w:fill="EAF4F4"/>
+        <w:ind w:left="173" w:right="173"/>
+      </w:pPr>
+      <w:r>
+        <w:rPr>
+          <w:rFonts w:ascii="맑은 고딕" w:hAnsi="맑은 고딕" w:eastAsia="맑은 고딕"/>
+          <w:b/>
+          <w:i w:val="0"/>
+          <w:color w:val="1F6D70"/>
+          <w:sz w:val="19"/>
+        </w:rPr>
+        <w:t>Model Answer  As part of the training, you will shadow a senior employee.</w:t>
+      </w:r>
+    </w:p>
+    <w:p>
+      <w:pPr>
+        <w:keepNext/>
+        <w:spacing w:before="60" w:after="20" w:line="269" w:lineRule="auto"/>
+        <w:ind w:left="72"/>
+      </w:pPr>
+      <w:r>
+        <w:rPr>
+          <w:rFonts w:ascii="맑은 고딕" w:hAnsi="맑은 고딕" w:eastAsia="맑은 고딕"/>
+          <w:b/>
+          <w:i w:val="0"/>
+          <w:sz w:val="20"/>
+        </w:rPr>
+        <w:t>030  새 프로젝트를 시작할 때마다 착수 회의를 엽니다.</w:t>
+      </w:r>
+    </w:p>
+    <w:p>
+      <w:pPr>
+        <w:keepNext w:val="0"/>
+        <w:spacing w:before="0" w:after="60" w:line="269" w:lineRule="auto"/>
+      </w:pPr>
+      <w:r>
+        <w:rPr>
+          <w:rFonts w:ascii="맑은 고딕" w:hAnsi="맑은 고딕" w:eastAsia="맑은 고딕"/>
+          <w:b w:val="0"/>
+          <w:i w:val="0"/>
+          <w:color w:val="595959"/>
+          <w:sz w:val="20"/>
+        </w:rPr>
+        <w:t>________________________ we start a new project, we hold a kickoff meeting.</w:t>
+      </w:r>
+    </w:p>
+    <w:p>
+      <w:pPr>
+        <w:keepNext w:val="0"/>
+        <w:spacing w:before="0" w:after="120" w:line="269" w:lineRule="auto"/>
+        <w:shd w:fill="EAF4F4"/>
+        <w:ind w:left="173" w:right="173"/>
+      </w:pPr>
+      <w:r>
+        <w:rPr>
+          <w:rFonts w:ascii="맑은 고딕" w:hAnsi="맑은 고딕" w:eastAsia="맑은 고딕"/>
+          <w:b/>
+          <w:i w:val="0"/>
+          <w:color w:val="1F6D70"/>
+          <w:sz w:val="19"/>
+        </w:rPr>
+        <w:t>Model Answer  Whenever we start a new project, we hold a kickoff meeting.</w:t>
+      </w:r>
+    </w:p>
+    <w:p>
+      <w:pPr>
+        <w:keepNext/>
+        <w:spacing w:before="60" w:after="20" w:line="269" w:lineRule="auto"/>
+        <w:ind w:left="72"/>
+      </w:pPr>
+      <w:r>
+        <w:rPr>
+          <w:rFonts w:ascii="맑은 고딕" w:hAnsi="맑은 고딕" w:eastAsia="맑은 고딕"/>
+          <w:b/>
+          <w:i w:val="0"/>
+          <w:sz w:val="20"/>
+        </w:rPr>
+        <w:t>031  회사는 주말 동안 시스템 업그레이드를 진행합니다.</w:t>
+      </w:r>
+    </w:p>
+    <w:p>
+      <w:pPr>
+        <w:keepNext w:val="0"/>
+        <w:spacing w:before="0" w:after="60" w:line="269" w:lineRule="auto"/>
+      </w:pPr>
+      <w:r>
+        <w:rPr>
+          <w:rFonts w:ascii="맑은 고딕" w:hAnsi="맑은 고딕" w:eastAsia="맑은 고딕"/>
+          <w:b w:val="0"/>
+          <w:i w:val="0"/>
+          <w:color w:val="595959"/>
+          <w:sz w:val="20"/>
+        </w:rPr>
+        <w:t>________________________ a system upgrade this weekend.</w:t>
+      </w:r>
+    </w:p>
+    <w:p>
+      <w:pPr>
+        <w:keepNext w:val="0"/>
+        <w:spacing w:before="0" w:after="120" w:line="269" w:lineRule="auto"/>
+        <w:shd w:fill="EAF4F4"/>
+        <w:ind w:left="173" w:right="173"/>
+      </w:pPr>
+      <w:r>
+        <w:rPr>
+          <w:rFonts w:ascii="맑은 고딕" w:hAnsi="맑은 고딕" w:eastAsia="맑은 고딕"/>
+          <w:b/>
+          <w:i w:val="0"/>
+          <w:color w:val="1F6D70"/>
+          <w:sz w:val="19"/>
+        </w:rPr>
+        <w:t>Model Answer  The company is undergoing a system upgrade this weekend.</w:t>
+      </w:r>
+    </w:p>
+    <w:p>
+      <w:r>
+        <w:br w:type="page"/>
+      </w:r>
+    </w:p>
+    <w:p>
+      <w:pPr>
+        <w:keepNext/>
+        <w:spacing w:before="0" w:after="140" w:line="269" w:lineRule="auto"/>
+      </w:pPr>
+      <w:r>
+        <w:rPr>
+          <w:rFonts w:ascii="맑은 고딕" w:hAnsi="맑은 고딕" w:eastAsia="맑은 고딕"/>
+          <w:b/>
+          <w:i w:val="0"/>
+          <w:color w:val="F47B20"/>
+          <w:sz w:val="32"/>
+        </w:rPr>
+        <w:t>Review 026~031 — Troubleshooting and Advanced Responses — Speaking Activity</w:t>
+      </w:r>
+    </w:p>
+    <w:p>
+      <w:pPr>
+        <w:keepNext/>
+        <w:spacing w:before="160" w:after="80" w:line="269" w:lineRule="auto"/>
+      </w:pPr>
+      <w:r>
+        <w:rPr>
+          <w:rFonts w:ascii="맑은 고딕" w:hAnsi="맑은 고딕" w:eastAsia="맑은 고딕"/>
+          <w:b w:val="0"/>
+          <w:i w:val="0"/>
+          <w:color w:val="F47B20"/>
+          <w:sz w:val="28"/>
+        </w:rPr>
+        <w:t>Task 3. Guided Role-Play — 상황에 맞게 대화를 완성하세요.</w:t>
+      </w:r>
+    </w:p>
+    <w:p>
+      <w:pPr>
+        <w:keepNext/>
+        <w:spacing w:before="100" w:after="80" w:line="269" w:lineRule="auto"/>
+        <w:shd w:fill="F7F7F7"/>
+        <w:ind w:left="144" w:right="144"/>
+      </w:pPr>
+      <w:r>
+        <w:rPr>
+          <w:rFonts w:ascii="맑은 고딕" w:hAnsi="맑은 고딕" w:eastAsia="맑은 고딕"/>
+          <w:b/>
+          <w:i w:val="0"/>
+          <w:sz w:val="20"/>
+        </w:rPr>
+        <w:t>Situation 1  화면 공유와 마이크 문제를 해결하도록 도움을 요청하세요.</w:t>
+      </w:r>
+    </w:p>
+    <w:p>
+      <w:pPr>
+        <w:keepNext w:val="0"/>
+        <w:spacing w:before="0" w:after="120" w:line="269" w:lineRule="auto"/>
+        <w:shd w:fill="EAF4F4"/>
+        <w:ind w:left="173" w:right="173"/>
+      </w:pPr>
+      <w:r>
+        <w:rPr>
+          <w:rFonts w:ascii="맑은 고딕" w:hAnsi="맑은 고딕" w:eastAsia="맑은 고딕"/>
+          <w:b/>
+          <w:i w:val="0"/>
+          <w:color w:val="1F6D70"/>
+          <w:sz w:val="19"/>
+        </w:rPr>
+        <w:t>Model Answer  A: I'm having trouble sharing my screen.</w:t>
+      </w:r>
+    </w:p>
+    <w:p>
+      <w:pPr>
+        <w:keepNext w:val="0"/>
+        <w:spacing w:before="0" w:after="120" w:line="269" w:lineRule="auto"/>
+        <w:shd w:fill="EAF4F4"/>
+        <w:ind w:left="173" w:right="173"/>
+      </w:pPr>
+      <w:r>
+        <w:rPr>
+          <w:rFonts w:ascii="맑은 고딕" w:hAnsi="맑은 고딕" w:eastAsia="맑은 고딕"/>
+          <w:b/>
+          <w:i w:val="0"/>
+          <w:color w:val="1F6D70"/>
+          <w:sz w:val="19"/>
+        </w:rPr>
+        <w:t>Model Answer  B: Can someone help me troubleshoot the sharing settings?</w:t>
+      </w:r>
+    </w:p>
+    <w:p>
+      <w:pPr>
+        <w:keepNext w:val="0"/>
+        <w:spacing w:before="0" w:after="120" w:line="269" w:lineRule="auto"/>
+        <w:shd w:fill="EAF4F4"/>
+        <w:ind w:left="173" w:right="173"/>
+      </w:pPr>
+      <w:r>
+        <w:rPr>
+          <w:rFonts w:ascii="맑은 고딕" w:hAnsi="맑은 고딕" w:eastAsia="맑은 고딕"/>
+          <w:b/>
+          <w:i w:val="0"/>
+          <w:color w:val="1F6D70"/>
+          <w:sz w:val="19"/>
+        </w:rPr>
+        <w:t>Model Answer  A: Whatever the cause is, let's test the microphone too.</w:t>
+      </w:r>
+    </w:p>
+    <w:p>
+      <w:pPr>
+        <w:keepNext/>
+        <w:spacing w:before="100" w:after="80" w:line="269" w:lineRule="auto"/>
+        <w:shd w:fill="F7F7F7"/>
+        <w:ind w:left="144" w:right="144"/>
+      </w:pPr>
+      <w:r>
+        <w:rPr>
+          <w:rFonts w:ascii="맑은 고딕" w:hAnsi="맑은 고딕" w:eastAsia="맑은 고딕"/>
+          <w:b/>
+          <w:i w:val="0"/>
+          <w:sz w:val="20"/>
+        </w:rPr>
+        <w:t>Situation 2  교육과 성과 평가가 진행 중임을 설명하고 회의 운영 원칙을 제안하세요.</w:t>
+      </w:r>
+    </w:p>
+    <w:p>
+      <w:pPr>
+        <w:keepNext w:val="0"/>
+        <w:spacing w:before="0" w:after="120" w:line="269" w:lineRule="auto"/>
+        <w:shd w:fill="EAF4F4"/>
+        <w:ind w:left="173" w:right="173"/>
+      </w:pPr>
+      <w:r>
+        <w:rPr>
+          <w:rFonts w:ascii="맑은 고딕" w:hAnsi="맑은 고딕" w:eastAsia="맑은 고딕"/>
+          <w:b/>
+          <w:i w:val="0"/>
+          <w:color w:val="1F6D70"/>
+          <w:sz w:val="19"/>
+        </w:rPr>
+        <w:t>Model Answer  A: As part of our safety program, the staff is undergoing training this afternoon.</w:t>
+      </w:r>
+    </w:p>
+    <w:p>
+      <w:pPr>
+        <w:keepNext w:val="0"/>
+        <w:spacing w:before="0" w:after="120" w:line="269" w:lineRule="auto"/>
+        <w:shd w:fill="EAF4F4"/>
+        <w:ind w:left="173" w:right="173"/>
+      </w:pPr>
+      <w:r>
+        <w:rPr>
+          <w:rFonts w:ascii="맑은 고딕" w:hAnsi="맑은 고딕" w:eastAsia="맑은 고딕"/>
+          <w:b/>
+          <w:i w:val="0"/>
+          <w:color w:val="1F6D70"/>
+          <w:sz w:val="19"/>
+        </w:rPr>
+        <w:t>Model Answer  B: Whenever we hold a training session, let's share the materials in advance.</w:t>
+      </w:r>
+    </w:p>
+    <w:p>
+      <w:pPr>
+        <w:keepNext w:val="0"/>
+        <w:spacing w:before="0" w:after="120" w:line="269" w:lineRule="auto"/>
+        <w:shd w:fill="EAF4F4"/>
+        <w:ind w:left="173" w:right="173"/>
+      </w:pPr>
+      <w:r>
+        <w:rPr>
+          <w:rFonts w:ascii="맑은 고딕" w:hAnsi="맑은 고딕" w:eastAsia="맑은 고딕"/>
+          <w:b/>
+          <w:i w:val="0"/>
+          <w:color w:val="1F6D70"/>
+          <w:sz w:val="19"/>
+        </w:rPr>
+        <w:t>Model Answer  A: Good idea. Whatever questions you have, feel free to ask.</w:t>
+      </w:r>
+    </w:p>
+    <w:p>
+      <w:pPr>
+        <w:keepNext/>
+        <w:spacing w:before="160" w:after="80" w:line="269" w:lineRule="auto"/>
+      </w:pPr>
+      <w:r>
+        <w:rPr>
+          <w:rFonts w:ascii="맑은 고딕" w:hAnsi="맑은 고딕" w:eastAsia="맑은 고딕"/>
+          <w:b w:val="0"/>
+          <w:i w:val="0"/>
+          <w:color w:val="F47B20"/>
+          <w:sz w:val="28"/>
+        </w:rPr>
+        <w:t>Self-Check</w:t>
+      </w:r>
+    </w:p>
+    <w:p>
+      <w:pPr>
+        <w:keepNext w:val="0"/>
+        <w:spacing w:before="0" w:after="80" w:line="269" w:lineRule="auto"/>
+      </w:pPr>
+      <w:r>
+        <w:rPr>
+          <w:rFonts w:ascii="맑은 고딕" w:hAnsi="맑은 고딕" w:eastAsia="맑은 고딕"/>
+          <w:b w:val="0"/>
+          <w:i w:val="0"/>
+          <w:sz w:val="20"/>
+        </w:rPr>
+        <w:t>☐  목표 패턴으로 문장을 시작했나요?</w:t>
+      </w:r>
+    </w:p>
+    <w:p>
+      <w:pPr>
+        <w:keepNext w:val="0"/>
+        <w:spacing w:before="0" w:after="80" w:line="269" w:lineRule="auto"/>
+      </w:pPr>
+      <w:r>
+        <w:rPr>
+          <w:rFonts w:ascii="맑은 고딕" w:hAnsi="맑은 고딕" w:eastAsia="맑은 고딕"/>
+          <w:b w:val="0"/>
+          <w:i w:val="0"/>
+          <w:sz w:val="20"/>
+        </w:rPr>
+        <w:t>☐  회의 상황에 맞는 어휘와 정중한 어조를 사용했나요?</w:t>
+      </w:r>
+    </w:p>
+    <w:p>
+      <w:pPr>
+        <w:keepNext w:val="0"/>
+        <w:spacing w:before="0" w:after="80" w:line="269" w:lineRule="auto"/>
+      </w:pPr>
+      <w:r>
+        <w:rPr>
+          <w:rFonts w:ascii="맑은 고딕" w:hAnsi="맑은 고딕" w:eastAsia="맑은 고딕"/>
+          <w:b w:val="0"/>
+          <w:i w:val="0"/>
+          <w:sz w:val="20"/>
+        </w:rPr>
+        <w:t>☐  문장을 보지 않고 한 번 더 말할 수 있나요?</w:t>
       </w:r>
     </w:p>
     <w:sectPr>

</xml_diff>